<commit_message>
Ultimate React Course: update Tailwind
</commit_message>
<xml_diff>
--- a/3.React/UltimateReactCourse/Document/4.docx
+++ b/3.React/UltimateReactCourse/Document/4.docx
@@ -956,7 +956,14 @@
           <w:sz w:val="40"/>
           <w:szCs w:val="40"/>
         </w:rPr>
-        <w:t>-Error Handling in Form Actions</w:t>
+        <w:t>+</w:t>
+      </w:r>
+      <w:r>
+        <w:rPr>
+          <w:sz w:val="40"/>
+          <w:szCs w:val="40"/>
+        </w:rPr>
+        <w:t>Error Handling in Form Actions</w:t>
       </w:r>
     </w:p>
     <w:p>
@@ -1067,9 +1074,17 @@
           <w:noProof/>
         </w:rPr>
         <w:drawing>
-          <wp:inline distT="0" distB="0" distL="0" distR="0" wp14:anchorId="1836721A" wp14:editId="4541133B">
+          <wp:anchor distT="0" distB="0" distL="114300" distR="114300" simplePos="0" relativeHeight="251658240" behindDoc="0" locked="0" layoutInCell="1" allowOverlap="1" wp14:anchorId="1836721A" wp14:editId="2C814660">
+            <wp:simplePos x="914400" y="5273644"/>
+            <wp:positionH relativeFrom="column">
+              <wp:align>left</wp:align>
+            </wp:positionH>
+            <wp:positionV relativeFrom="paragraph">
+              <wp:align>top</wp:align>
+            </wp:positionV>
             <wp:extent cx="3364173" cy="1124274"/>
             <wp:effectExtent l="0" t="0" r="8255" b="0"/>
+            <wp:wrapSquare wrapText="bothSides"/>
             <wp:docPr id="1908070241" name="Picture 1" descr="A screen shot of a computer code&#10;&#10;AI-generated content may be incorrect."/>
             <wp:cNvGraphicFramePr>
               <a:graphicFrameLocks xmlns:a="http://schemas.openxmlformats.org/drawingml/2006/main" noChangeAspect="1"/>
@@ -1082,7 +1097,13 @@
                     <pic:cNvPicPr/>
                   </pic:nvPicPr>
                   <pic:blipFill>
-                    <a:blip r:embed="rId21"/>
+                    <a:blip r:embed="rId21">
+                      <a:extLst>
+                        <a:ext uri="{28A0092B-C50C-407E-A947-70E740481C1C}">
+                          <a14:useLocalDpi xmlns:a14="http://schemas.microsoft.com/office/drawing/2010/main" val="0"/>
+                        </a:ext>
+                      </a:extLst>
+                    </a:blip>
                     <a:stretch>
                       <a:fillRect/>
                     </a:stretch>
@@ -1090,7 +1111,140 @@
                   <pic:spPr>
                     <a:xfrm>
                       <a:off x="0" y="0"/>
-                      <a:ext cx="3372733" cy="1127135"/>
+                      <a:ext cx="3364173" cy="1124274"/>
+                    </a:xfrm>
+                    <a:prstGeom prst="rect">
+                      <a:avLst/>
+                    </a:prstGeom>
+                  </pic:spPr>
+                </pic:pic>
+              </a:graphicData>
+            </a:graphic>
+          </wp:anchor>
+        </w:drawing>
+      </w:r>
+      <w:r>
+        <w:rPr>
+          <w:sz w:val="40"/>
+          <w:szCs w:val="40"/>
+        </w:rPr>
+        <w:br w:type="textWrapping" w:clear="all"/>
+      </w:r>
+    </w:p>
+    <w:p>
+      <w:pPr>
+        <w:rPr>
+          <w:sz w:val="40"/>
+          <w:szCs w:val="40"/>
+        </w:rPr>
+      </w:pPr>
+      <w:r>
+        <w:rPr>
+          <w:sz w:val="40"/>
+          <w:szCs w:val="40"/>
+        </w:rPr>
+        <w:t>-Tailwind</w:t>
+      </w:r>
+    </w:p>
+    <w:p>
+      <w:pPr>
+        <w:rPr>
+          <w:sz w:val="40"/>
+          <w:szCs w:val="40"/>
+        </w:rPr>
+      </w:pPr>
+      <w:r>
+        <w:rPr>
+          <w:sz w:val="40"/>
+          <w:szCs w:val="40"/>
+        </w:rPr>
+        <w:t xml:space="preserve">+Color: </w:t>
+      </w:r>
+    </w:p>
+    <w:p>
+      <w:pPr>
+        <w:rPr>
+          <w:sz w:val="40"/>
+          <w:szCs w:val="40"/>
+        </w:rPr>
+      </w:pPr>
+      <w:r>
+        <w:rPr>
+          <w:sz w:val="40"/>
+          <w:szCs w:val="40"/>
+        </w:rPr>
+        <w:t xml:space="preserve">Overview: </w:t>
+      </w:r>
+      <w:r>
+        <w:rPr>
+          <w:sz w:val="40"/>
+          <w:szCs w:val="40"/>
+        </w:rPr>
+        <w:t>https://v3.tailwindcss.com/docs/customizing-colors</w:t>
+      </w:r>
+    </w:p>
+    <w:p>
+      <w:pPr>
+        <w:rPr>
+          <w:sz w:val="40"/>
+          <w:szCs w:val="40"/>
+        </w:rPr>
+      </w:pPr>
+      <w:r>
+        <w:rPr>
+          <w:sz w:val="40"/>
+          <w:szCs w:val="40"/>
+        </w:rPr>
+        <w:t xml:space="preserve">Text color: </w:t>
+      </w:r>
+      <w:hyperlink r:id="rId22" w:history="1">
+        <w:r>
+          <w:rPr>
+            <w:rStyle w:val="Hyperlink"/>
+            <w:sz w:val="40"/>
+            <w:szCs w:val="40"/>
+          </w:rPr>
+          <w:t>https://v3.tailwindcss.com/docs/text-color</w:t>
+        </w:r>
+      </w:hyperlink>
+    </w:p>
+    <w:p>
+      <w:pPr>
+        <w:rPr>
+          <w:sz w:val="40"/>
+          <w:szCs w:val="40"/>
+        </w:rPr>
+      </w:pPr>
+      <w:r>
+        <w:rPr>
+          <w:noProof/>
+        </w:rPr>
+        <w:lastRenderedPageBreak/>
+        <w:drawing>
+          <wp:inline distT="0" distB="0" distL="0" distR="0" wp14:anchorId="7F6534C9" wp14:editId="55322A47">
+            <wp:extent cx="4227968" cy="191455"/>
+            <wp:effectExtent l="0" t="0" r="1270" b="0"/>
+            <wp:docPr id="740328517" name="Picture 1"/>
+            <wp:cNvGraphicFramePr>
+              <a:graphicFrameLocks xmlns:a="http://schemas.openxmlformats.org/drawingml/2006/main" noChangeAspect="1"/>
+            </wp:cNvGraphicFramePr>
+            <a:graphic xmlns:a="http://schemas.openxmlformats.org/drawingml/2006/main">
+              <a:graphicData uri="http://schemas.openxmlformats.org/drawingml/2006/picture">
+                <pic:pic xmlns:pic="http://schemas.openxmlformats.org/drawingml/2006/picture">
+                  <pic:nvPicPr>
+                    <pic:cNvPr id="740328517" name=""/>
+                    <pic:cNvPicPr/>
+                  </pic:nvPicPr>
+                  <pic:blipFill>
+                    <a:blip r:embed="rId23"/>
+                    <a:stretch>
+                      <a:fillRect/>
+                    </a:stretch>
+                  </pic:blipFill>
+                  <pic:spPr>
+                    <a:xfrm>
+                      <a:off x="0" y="0"/>
+                      <a:ext cx="4382169" cy="198438"/>
                     </a:xfrm>
                     <a:prstGeom prst="rect">
                       <a:avLst/>
@@ -1102,6 +1256,873 @@
           </wp:inline>
         </w:drawing>
       </w:r>
+    </w:p>
+    <w:p>
+      <w:pPr>
+        <w:rPr>
+          <w:sz w:val="40"/>
+          <w:szCs w:val="40"/>
+        </w:rPr>
+      </w:pPr>
+      <w:r>
+        <w:rPr>
+          <w:sz w:val="40"/>
+          <w:szCs w:val="40"/>
+        </w:rPr>
+        <w:t xml:space="preserve">Background color: </w:t>
+      </w:r>
+      <w:hyperlink r:id="rId24" w:history="1">
+        <w:r>
+          <w:rPr>
+            <w:rStyle w:val="Hyperlink"/>
+            <w:sz w:val="40"/>
+            <w:szCs w:val="40"/>
+          </w:rPr>
+          <w:t>https://v3.tailwindcss.com/docs/background-color</w:t>
+        </w:r>
+      </w:hyperlink>
+    </w:p>
+    <w:p>
+      <w:pPr>
+        <w:rPr>
+          <w:sz w:val="40"/>
+          <w:szCs w:val="40"/>
+        </w:rPr>
+      </w:pPr>
+      <w:r>
+        <w:rPr>
+          <w:noProof/>
+        </w:rPr>
+        <w:drawing>
+          <wp:inline distT="0" distB="0" distL="0" distR="0" wp14:anchorId="5830CEA6" wp14:editId="1ADCFC39">
+            <wp:extent cx="2571184" cy="188135"/>
+            <wp:effectExtent l="0" t="0" r="635" b="2540"/>
+            <wp:docPr id="1504269455" name="Picture 1"/>
+            <wp:cNvGraphicFramePr>
+              <a:graphicFrameLocks xmlns:a="http://schemas.openxmlformats.org/drawingml/2006/main" noChangeAspect="1"/>
+            </wp:cNvGraphicFramePr>
+            <a:graphic xmlns:a="http://schemas.openxmlformats.org/drawingml/2006/main">
+              <a:graphicData uri="http://schemas.openxmlformats.org/drawingml/2006/picture">
+                <pic:pic xmlns:pic="http://schemas.openxmlformats.org/drawingml/2006/picture">
+                  <pic:nvPicPr>
+                    <pic:cNvPr id="1504269455" name=""/>
+                    <pic:cNvPicPr/>
+                  </pic:nvPicPr>
+                  <pic:blipFill>
+                    <a:blip r:embed="rId25"/>
+                    <a:stretch>
+                      <a:fillRect/>
+                    </a:stretch>
+                  </pic:blipFill>
+                  <pic:spPr>
+                    <a:xfrm>
+                      <a:off x="0" y="0"/>
+                      <a:ext cx="2595602" cy="189922"/>
+                    </a:xfrm>
+                    <a:prstGeom prst="rect">
+                      <a:avLst/>
+                    </a:prstGeom>
+                  </pic:spPr>
+                </pic:pic>
+              </a:graphicData>
+            </a:graphic>
+          </wp:inline>
+        </w:drawing>
+      </w:r>
+    </w:p>
+    <w:p>
+      <w:pPr>
+        <w:rPr>
+          <w:sz w:val="40"/>
+          <w:szCs w:val="40"/>
+        </w:rPr>
+      </w:pPr>
+      <w:r>
+        <w:rPr>
+          <w:sz w:val="40"/>
+          <w:szCs w:val="40"/>
+        </w:rPr>
+        <w:t>+Text</w:t>
+      </w:r>
+    </w:p>
+    <w:p>
+      <w:pPr>
+        <w:rPr>
+          <w:sz w:val="40"/>
+          <w:szCs w:val="40"/>
+        </w:rPr>
+      </w:pPr>
+      <w:r>
+        <w:rPr>
+          <w:sz w:val="40"/>
+          <w:szCs w:val="40"/>
+        </w:rPr>
+        <w:t xml:space="preserve">Text align: </w:t>
+      </w:r>
+      <w:hyperlink r:id="rId26" w:history="1">
+        <w:r>
+          <w:rPr>
+            <w:rStyle w:val="Hyperlink"/>
+            <w:sz w:val="40"/>
+            <w:szCs w:val="40"/>
+          </w:rPr>
+          <w:t>https://v3.tailwindcss.com/docs/text-align</w:t>
+        </w:r>
+      </w:hyperlink>
+    </w:p>
+    <w:p>
+      <w:pPr>
+        <w:rPr>
+          <w:sz w:val="40"/>
+          <w:szCs w:val="40"/>
+        </w:rPr>
+      </w:pPr>
+      <w:r>
+        <w:rPr>
+          <w:sz w:val="40"/>
+          <w:szCs w:val="40"/>
+        </w:rPr>
+        <w:t xml:space="preserve">Font size: </w:t>
+      </w:r>
+      <w:hyperlink r:id="rId27" w:history="1">
+        <w:r>
+          <w:rPr>
+            <w:rStyle w:val="Hyperlink"/>
+            <w:sz w:val="40"/>
+            <w:szCs w:val="40"/>
+          </w:rPr>
+          <w:t>https://v3.tailwindcss.com/docs/font-size</w:t>
+        </w:r>
+      </w:hyperlink>
+    </w:p>
+    <w:p>
+      <w:pPr>
+        <w:rPr>
+          <w:sz w:val="40"/>
+          <w:szCs w:val="40"/>
+        </w:rPr>
+      </w:pPr>
+      <w:r>
+        <w:rPr>
+          <w:sz w:val="40"/>
+          <w:szCs w:val="40"/>
+        </w:rPr>
+        <w:t xml:space="preserve">Font weight: </w:t>
+      </w:r>
+      <w:hyperlink r:id="rId28" w:history="1">
+        <w:r>
+          <w:rPr>
+            <w:rStyle w:val="Hyperlink"/>
+            <w:sz w:val="40"/>
+            <w:szCs w:val="40"/>
+          </w:rPr>
+          <w:t>https://v3.tailwindcss.com/docs/font-weight</w:t>
+        </w:r>
+      </w:hyperlink>
+    </w:p>
+    <w:p>
+      <w:pPr>
+        <w:rPr>
+          <w:sz w:val="40"/>
+          <w:szCs w:val="40"/>
+        </w:rPr>
+      </w:pPr>
+      <w:r>
+        <w:rPr>
+          <w:sz w:val="40"/>
+          <w:szCs w:val="40"/>
+        </w:rPr>
+        <w:t xml:space="preserve">Text transform: </w:t>
+      </w:r>
+      <w:hyperlink r:id="rId29" w:history="1">
+        <w:r>
+          <w:rPr>
+            <w:rStyle w:val="Hyperlink"/>
+            <w:sz w:val="40"/>
+            <w:szCs w:val="40"/>
+          </w:rPr>
+          <w:t>https://v3.tailwindcss.com/docs/text-transform</w:t>
+        </w:r>
+      </w:hyperlink>
+    </w:p>
+    <w:p>
+      <w:pPr>
+        <w:rPr>
+          <w:sz w:val="40"/>
+          <w:szCs w:val="40"/>
+        </w:rPr>
+      </w:pPr>
+      <w:r>
+        <w:rPr>
+          <w:sz w:val="40"/>
+          <w:szCs w:val="40"/>
+        </w:rPr>
+        <w:t xml:space="preserve">Letter spacing: </w:t>
+      </w:r>
+      <w:hyperlink r:id="rId30" w:history="1">
+        <w:r>
+          <w:rPr>
+            <w:rStyle w:val="Hyperlink"/>
+            <w:sz w:val="40"/>
+            <w:szCs w:val="40"/>
+          </w:rPr>
+          <w:t>https://v3.tailwindcss.com/docs/letter-spacing</w:t>
+        </w:r>
+      </w:hyperlink>
+    </w:p>
+    <w:p>
+      <w:pPr>
+        <w:rPr>
+          <w:sz w:val="40"/>
+          <w:szCs w:val="40"/>
+        </w:rPr>
+      </w:pPr>
+      <w:r>
+        <w:rPr>
+          <w:sz w:val="40"/>
+          <w:szCs w:val="40"/>
+        </w:rPr>
+        <w:t>+Box model</w:t>
+      </w:r>
+    </w:p>
+    <w:p>
+      <w:pPr>
+        <w:rPr>
+          <w:sz w:val="40"/>
+          <w:szCs w:val="40"/>
+        </w:rPr>
+      </w:pPr>
+      <w:r>
+        <w:rPr>
+          <w:sz w:val="40"/>
+          <w:szCs w:val="40"/>
+        </w:rPr>
+        <w:t xml:space="preserve">Margin: </w:t>
+      </w:r>
+      <w:hyperlink r:id="rId31" w:history="1">
+        <w:r>
+          <w:rPr>
+            <w:rStyle w:val="Hyperlink"/>
+            <w:sz w:val="40"/>
+            <w:szCs w:val="40"/>
+          </w:rPr>
+          <w:t>https://v3.tailwindcss.com/docs/margin</w:t>
+        </w:r>
+      </w:hyperlink>
+    </w:p>
+    <w:p>
+      <w:pPr>
+        <w:rPr>
+          <w:sz w:val="40"/>
+          <w:szCs w:val="40"/>
+        </w:rPr>
+      </w:pPr>
+      <w:r>
+        <w:rPr>
+          <w:sz w:val="40"/>
+          <w:szCs w:val="40"/>
+        </w:rPr>
+        <w:t xml:space="preserve">Padding: </w:t>
+      </w:r>
+      <w:hyperlink r:id="rId32" w:history="1">
+        <w:r>
+          <w:rPr>
+            <w:rStyle w:val="Hyperlink"/>
+            <w:sz w:val="40"/>
+            <w:szCs w:val="40"/>
+          </w:rPr>
+          <w:t>https://v3.tailwindcss.com/docs/padding</w:t>
+        </w:r>
+      </w:hyperlink>
+    </w:p>
+    <w:p>
+      <w:pPr>
+        <w:rPr>
+          <w:sz w:val="40"/>
+          <w:szCs w:val="40"/>
+        </w:rPr>
+      </w:pPr>
+      <w:r>
+        <w:rPr>
+          <w:sz w:val="40"/>
+          <w:szCs w:val="40"/>
+        </w:rPr>
+        <w:t xml:space="preserve">Border width: </w:t>
+      </w:r>
+      <w:hyperlink r:id="rId33" w:history="1">
+        <w:r>
+          <w:rPr>
+            <w:rStyle w:val="Hyperlink"/>
+            <w:sz w:val="40"/>
+            <w:szCs w:val="40"/>
+          </w:rPr>
+          <w:t>https://v3.tailwindcss.com/docs/border-width</w:t>
+        </w:r>
+      </w:hyperlink>
+    </w:p>
+    <w:p>
+      <w:pPr>
+        <w:rPr>
+          <w:sz w:val="40"/>
+          <w:szCs w:val="40"/>
+        </w:rPr>
+      </w:pPr>
+      <w:r>
+        <w:rPr>
+          <w:sz w:val="40"/>
+          <w:szCs w:val="40"/>
+        </w:rPr>
+        <w:t xml:space="preserve">Space between: </w:t>
+      </w:r>
+      <w:hyperlink r:id="rId34" w:history="1">
+        <w:r>
+          <w:rPr>
+            <w:rStyle w:val="Hyperlink"/>
+            <w:sz w:val="40"/>
+            <w:szCs w:val="40"/>
+          </w:rPr>
+          <w:t>https://v3.tailwindcss.com/docs/space</w:t>
+        </w:r>
+      </w:hyperlink>
+    </w:p>
+    <w:p>
+      <w:pPr>
+        <w:rPr>
+          <w:sz w:val="40"/>
+          <w:szCs w:val="40"/>
+        </w:rPr>
+      </w:pPr>
+      <w:r>
+        <w:rPr>
+          <w:sz w:val="40"/>
+          <w:szCs w:val="40"/>
+        </w:rPr>
+        <w:lastRenderedPageBreak/>
+        <w:t xml:space="preserve">Display: </w:t>
+      </w:r>
+      <w:hyperlink r:id="rId35" w:history="1">
+        <w:r>
+          <w:rPr>
+            <w:rStyle w:val="Hyperlink"/>
+            <w:sz w:val="40"/>
+            <w:szCs w:val="40"/>
+          </w:rPr>
+          <w:t>https://v3.tailwindcss.com/docs/display</w:t>
+        </w:r>
+      </w:hyperlink>
+    </w:p>
+    <w:p>
+      <w:pPr>
+        <w:rPr>
+          <w:sz w:val="40"/>
+          <w:szCs w:val="40"/>
+        </w:rPr>
+      </w:pPr>
+      <w:r>
+        <w:rPr>
+          <w:sz w:val="40"/>
+          <w:szCs w:val="40"/>
+        </w:rPr>
+        <w:t xml:space="preserve">+Responsive design: </w:t>
+      </w:r>
+      <w:hyperlink r:id="rId36" w:history="1">
+        <w:r>
+          <w:rPr>
+            <w:rStyle w:val="Hyperlink"/>
+            <w:sz w:val="40"/>
+            <w:szCs w:val="40"/>
+          </w:rPr>
+          <w:t>https://v3.tailwindcss.com/docs/responsive-design</w:t>
+        </w:r>
+      </w:hyperlink>
+    </w:p>
+    <w:p>
+      <w:pPr>
+        <w:rPr>
+          <w:sz w:val="40"/>
+          <w:szCs w:val="40"/>
+        </w:rPr>
+      </w:pPr>
+      <w:r>
+        <w:rPr>
+          <w:noProof/>
+        </w:rPr>
+        <w:drawing>
+          <wp:inline distT="0" distB="0" distL="0" distR="0" wp14:anchorId="3E53D603" wp14:editId="0D8812F2">
+            <wp:extent cx="3526325" cy="464404"/>
+            <wp:effectExtent l="0" t="0" r="0" b="0"/>
+            <wp:docPr id="1572943693" name="Picture 1" descr="A black background with white text&#10;&#10;AI-generated content may be incorrect."/>
+            <wp:cNvGraphicFramePr>
+              <a:graphicFrameLocks xmlns:a="http://schemas.openxmlformats.org/drawingml/2006/main" noChangeAspect="1"/>
+            </wp:cNvGraphicFramePr>
+            <a:graphic xmlns:a="http://schemas.openxmlformats.org/drawingml/2006/main">
+              <a:graphicData uri="http://schemas.openxmlformats.org/drawingml/2006/picture">
+                <pic:pic xmlns:pic="http://schemas.openxmlformats.org/drawingml/2006/picture">
+                  <pic:nvPicPr>
+                    <pic:cNvPr id="1572943693" name="Picture 1" descr="A black background with white text&#10;&#10;AI-generated content may be incorrect."/>
+                    <pic:cNvPicPr/>
+                  </pic:nvPicPr>
+                  <pic:blipFill>
+                    <a:blip r:embed="rId37"/>
+                    <a:stretch>
+                      <a:fillRect/>
+                    </a:stretch>
+                  </pic:blipFill>
+                  <pic:spPr>
+                    <a:xfrm>
+                      <a:off x="0" y="0"/>
+                      <a:ext cx="3561810" cy="469077"/>
+                    </a:xfrm>
+                    <a:prstGeom prst="rect">
+                      <a:avLst/>
+                    </a:prstGeom>
+                  </pic:spPr>
+                </pic:pic>
+              </a:graphicData>
+            </a:graphic>
+          </wp:inline>
+        </w:drawing>
+      </w:r>
+    </w:p>
+    <w:p>
+      <w:pPr>
+        <w:rPr>
+          <w:sz w:val="40"/>
+          <w:szCs w:val="40"/>
+        </w:rPr>
+      </w:pPr>
+      <w:r>
+        <w:rPr>
+          <w:sz w:val="40"/>
+          <w:szCs w:val="40"/>
+        </w:rPr>
+        <w:t>+Flexbox</w:t>
+      </w:r>
+    </w:p>
+    <w:p>
+      <w:pPr>
+        <w:rPr>
+          <w:sz w:val="40"/>
+          <w:szCs w:val="40"/>
+        </w:rPr>
+      </w:pPr>
+      <w:r>
+        <w:rPr>
+          <w:sz w:val="40"/>
+          <w:szCs w:val="40"/>
+        </w:rPr>
+        <w:t xml:space="preserve">Justify content: </w:t>
+      </w:r>
+      <w:r>
+        <w:rPr>
+          <w:sz w:val="40"/>
+          <w:szCs w:val="40"/>
+        </w:rPr>
+        <w:t>https://v3.tailwindcss.com/docs/justify-content</w:t>
+      </w:r>
+    </w:p>
+    <w:p>
+      <w:pPr>
+        <w:rPr>
+          <w:sz w:val="40"/>
+          <w:szCs w:val="40"/>
+        </w:rPr>
+      </w:pPr>
+      <w:r>
+        <w:rPr>
+          <w:sz w:val="40"/>
+          <w:szCs w:val="40"/>
+        </w:rPr>
+        <w:t xml:space="preserve">Justify items: </w:t>
+      </w:r>
+      <w:hyperlink r:id="rId38" w:history="1">
+        <w:r>
+          <w:rPr>
+            <w:rStyle w:val="Hyperlink"/>
+            <w:sz w:val="40"/>
+            <w:szCs w:val="40"/>
+          </w:rPr>
+          <w:t>https://v3.tailwindcss.com/docs/justify-items</w:t>
+        </w:r>
+      </w:hyperlink>
+    </w:p>
+    <w:p>
+      <w:pPr>
+        <w:rPr>
+          <w:sz w:val="40"/>
+          <w:szCs w:val="40"/>
+        </w:rPr>
+      </w:pPr>
+      <w:r>
+        <w:rPr>
+          <w:noProof/>
+        </w:rPr>
+        <w:drawing>
+          <wp:inline distT="0" distB="0" distL="0" distR="0" wp14:anchorId="558432CF" wp14:editId="3543201B">
+            <wp:extent cx="4291343" cy="174969"/>
+            <wp:effectExtent l="0" t="0" r="0" b="0"/>
+            <wp:docPr id="657159822" name="Picture 1"/>
+            <wp:cNvGraphicFramePr>
+              <a:graphicFrameLocks xmlns:a="http://schemas.openxmlformats.org/drawingml/2006/main" noChangeAspect="1"/>
+            </wp:cNvGraphicFramePr>
+            <a:graphic xmlns:a="http://schemas.openxmlformats.org/drawingml/2006/main">
+              <a:graphicData uri="http://schemas.openxmlformats.org/drawingml/2006/picture">
+                <pic:pic xmlns:pic="http://schemas.openxmlformats.org/drawingml/2006/picture">
+                  <pic:nvPicPr>
+                    <pic:cNvPr id="657159822" name=""/>
+                    <pic:cNvPicPr/>
+                  </pic:nvPicPr>
+                  <pic:blipFill>
+                    <a:blip r:embed="rId39"/>
+                    <a:stretch>
+                      <a:fillRect/>
+                    </a:stretch>
+                  </pic:blipFill>
+                  <pic:spPr>
+                    <a:xfrm>
+                      <a:off x="0" y="0"/>
+                      <a:ext cx="4359095" cy="177731"/>
+                    </a:xfrm>
+                    <a:prstGeom prst="rect">
+                      <a:avLst/>
+                    </a:prstGeom>
+                  </pic:spPr>
+                </pic:pic>
+              </a:graphicData>
+            </a:graphic>
+          </wp:inline>
+        </w:drawing>
+      </w:r>
+    </w:p>
+    <w:p>
+      <w:pPr>
+        <w:rPr>
+          <w:sz w:val="40"/>
+          <w:szCs w:val="40"/>
+        </w:rPr>
+      </w:pPr>
+      <w:r>
+        <w:rPr>
+          <w:sz w:val="40"/>
+          <w:szCs w:val="40"/>
+        </w:rPr>
+        <w:t>+CSS Grid</w:t>
+      </w:r>
+    </w:p>
+    <w:p>
+      <w:pPr>
+        <w:rPr>
+          <w:sz w:val="40"/>
+          <w:szCs w:val="40"/>
+        </w:rPr>
+      </w:pPr>
+      <w:r>
+        <w:rPr>
+          <w:sz w:val="40"/>
+          <w:szCs w:val="40"/>
+        </w:rPr>
+        <w:t xml:space="preserve">Grid template columns: </w:t>
+      </w:r>
+      <w:hyperlink r:id="rId40" w:history="1">
+        <w:r>
+          <w:rPr>
+            <w:rStyle w:val="Hyperlink"/>
+            <w:sz w:val="40"/>
+            <w:szCs w:val="40"/>
+          </w:rPr>
+          <w:t>https://v3.tailwindcss.com/docs/grid-template-columns</w:t>
+        </w:r>
+      </w:hyperlink>
+    </w:p>
+    <w:p>
+      <w:pPr>
+        <w:rPr>
+          <w:sz w:val="40"/>
+          <w:szCs w:val="40"/>
+        </w:rPr>
+      </w:pPr>
+      <w:r>
+        <w:rPr>
+          <w:sz w:val="40"/>
+          <w:szCs w:val="40"/>
+        </w:rPr>
+        <w:t xml:space="preserve">Grid Column start/end: </w:t>
+      </w:r>
+      <w:r>
+        <w:rPr>
+          <w:sz w:val="40"/>
+          <w:szCs w:val="40"/>
+        </w:rPr>
+        <w:t>https://v3.tailwindcss.com/docs/grid-column</w:t>
+      </w:r>
+    </w:p>
+    <w:p>
+      <w:pPr>
+        <w:rPr>
+          <w:sz w:val="40"/>
+          <w:szCs w:val="40"/>
+        </w:rPr>
+      </w:pPr>
+      <w:r>
+        <w:rPr>
+          <w:sz w:val="40"/>
+          <w:szCs w:val="40"/>
+        </w:rPr>
+        <w:t xml:space="preserve">Grid template rows: </w:t>
+      </w:r>
+      <w:hyperlink r:id="rId41" w:history="1">
+        <w:r>
+          <w:rPr>
+            <w:rStyle w:val="Hyperlink"/>
+            <w:sz w:val="40"/>
+            <w:szCs w:val="40"/>
+          </w:rPr>
+          <w:t>https://v3.tailwindcss.com/docs/grid-template-rows</w:t>
+        </w:r>
+      </w:hyperlink>
+    </w:p>
+    <w:p>
+      <w:pPr>
+        <w:rPr>
+          <w:sz w:val="40"/>
+          <w:szCs w:val="40"/>
+        </w:rPr>
+      </w:pPr>
+      <w:r>
+        <w:rPr>
+          <w:sz w:val="40"/>
+          <w:szCs w:val="40"/>
+        </w:rPr>
+        <w:lastRenderedPageBreak/>
+        <w:t xml:space="preserve">Grid Row start/end: </w:t>
+      </w:r>
+      <w:hyperlink r:id="rId42" w:history="1">
+        <w:r>
+          <w:rPr>
+            <w:rStyle w:val="Hyperlink"/>
+            <w:sz w:val="40"/>
+            <w:szCs w:val="40"/>
+          </w:rPr>
+          <w:t>https://v3.tailwindcss.com/docs/grid-row</w:t>
+        </w:r>
+      </w:hyperlink>
+    </w:p>
+    <w:p>
+      <w:pPr>
+        <w:rPr>
+          <w:sz w:val="40"/>
+          <w:szCs w:val="40"/>
+        </w:rPr>
+      </w:pPr>
+      <w:r>
+        <w:rPr>
+          <w:sz w:val="40"/>
+          <w:szCs w:val="40"/>
+        </w:rPr>
+        <w:t xml:space="preserve">Grid auto flow: </w:t>
+      </w:r>
+      <w:r>
+        <w:rPr>
+          <w:sz w:val="40"/>
+          <w:szCs w:val="40"/>
+        </w:rPr>
+        <w:t>https://v3.tailwindcss.com/docs/grid-auto-flow</w:t>
+      </w:r>
+    </w:p>
+    <w:p>
+      <w:pPr>
+        <w:rPr>
+          <w:sz w:val="40"/>
+          <w:szCs w:val="40"/>
+        </w:rPr>
+      </w:pPr>
+      <w:r>
+        <w:rPr>
+          <w:sz w:val="40"/>
+          <w:szCs w:val="40"/>
+        </w:rPr>
+        <w:t xml:space="preserve">Grid auto columns: </w:t>
+      </w:r>
+      <w:hyperlink r:id="rId43" w:history="1">
+        <w:r>
+          <w:rPr>
+            <w:rStyle w:val="Hyperlink"/>
+            <w:sz w:val="40"/>
+            <w:szCs w:val="40"/>
+          </w:rPr>
+          <w:t>https://v3.tailwindcss.com/docs/grid-auto-columns</w:t>
+        </w:r>
+      </w:hyperlink>
+    </w:p>
+    <w:p>
+      <w:pPr>
+        <w:rPr>
+          <w:sz w:val="40"/>
+          <w:szCs w:val="40"/>
+        </w:rPr>
+      </w:pPr>
+      <w:r>
+        <w:rPr>
+          <w:sz w:val="40"/>
+          <w:szCs w:val="40"/>
+        </w:rPr>
+        <w:t xml:space="preserve">Grid auto rows: </w:t>
+      </w:r>
+      <w:hyperlink r:id="rId44" w:history="1">
+        <w:r>
+          <w:rPr>
+            <w:rStyle w:val="Hyperlink"/>
+            <w:sz w:val="40"/>
+            <w:szCs w:val="40"/>
+          </w:rPr>
+          <w:t>https://v3.tailwindcss.com/docs/grid-auto-rows</w:t>
+        </w:r>
+      </w:hyperlink>
+    </w:p>
+    <w:p>
+      <w:pPr>
+        <w:rPr>
+          <w:sz w:val="40"/>
+          <w:szCs w:val="40"/>
+        </w:rPr>
+      </w:pPr>
+      <w:r>
+        <w:rPr>
+          <w:sz w:val="40"/>
+          <w:szCs w:val="40"/>
+        </w:rPr>
+        <w:t xml:space="preserve">+Overflow: </w:t>
+      </w:r>
+      <w:hyperlink r:id="rId45" w:history="1">
+        <w:r>
+          <w:rPr>
+            <w:rStyle w:val="Hyperlink"/>
+            <w:sz w:val="40"/>
+            <w:szCs w:val="40"/>
+          </w:rPr>
+          <w:t>https://v3.tailwindcss.com/docs/overflow</w:t>
+        </w:r>
+      </w:hyperlink>
+    </w:p>
+    <w:p>
+      <w:pPr>
+        <w:rPr>
+          <w:sz w:val="40"/>
+          <w:szCs w:val="40"/>
+        </w:rPr>
+      </w:pPr>
+      <w:r>
+        <w:rPr>
+          <w:sz w:val="40"/>
+          <w:szCs w:val="40"/>
+        </w:rPr>
+        <w:t xml:space="preserve">+Max-width: </w:t>
+      </w:r>
+      <w:hyperlink r:id="rId46" w:history="1">
+        <w:r>
+          <w:rPr>
+            <w:rStyle w:val="Hyperlink"/>
+            <w:sz w:val="40"/>
+            <w:szCs w:val="40"/>
+          </w:rPr>
+          <w:t>https://v3.tailwindcss.com/docs/max-width</w:t>
+        </w:r>
+      </w:hyperlink>
+    </w:p>
+    <w:p>
+      <w:pPr>
+        <w:rPr>
+          <w:sz w:val="40"/>
+          <w:szCs w:val="40"/>
+        </w:rPr>
+      </w:pPr>
+      <w:r>
+        <w:rPr>
+          <w:sz w:val="40"/>
+          <w:szCs w:val="40"/>
+        </w:rPr>
+        <w:t xml:space="preserve">+Container:  </w:t>
+      </w:r>
+      <w:hyperlink r:id="rId47" w:history="1">
+        <w:r>
+          <w:rPr>
+            <w:rStyle w:val="Hyperlink"/>
+            <w:sz w:val="40"/>
+            <w:szCs w:val="40"/>
+          </w:rPr>
+          <w:t>https://v3.tailwindcss.com/docs/container</w:t>
+        </w:r>
+      </w:hyperlink>
+    </w:p>
+    <w:p>
+      <w:pPr>
+        <w:rPr>
+          <w:sz w:val="40"/>
+          <w:szCs w:val="40"/>
+        </w:rPr>
+      </w:pPr>
+      <w:r>
+        <w:rPr>
+          <w:sz w:val="40"/>
+          <w:szCs w:val="40"/>
+        </w:rPr>
+        <w:t>+Styling Buttons: element states and transitions</w:t>
+      </w:r>
+    </w:p>
+    <w:p>
+      <w:pPr>
+        <w:rPr>
+          <w:sz w:val="40"/>
+          <w:szCs w:val="40"/>
+        </w:rPr>
+      </w:pPr>
+      <w:r>
+        <w:rPr>
+          <w:sz w:val="40"/>
+          <w:szCs w:val="40"/>
+        </w:rPr>
+        <w:t xml:space="preserve">Hover: </w:t>
+      </w:r>
+      <w:hyperlink r:id="rId48" w:history="1">
+        <w:r>
+          <w:rPr>
+            <w:rStyle w:val="Hyperlink"/>
+            <w:sz w:val="40"/>
+            <w:szCs w:val="40"/>
+          </w:rPr>
+          <w:t>https://v3.tailwindcss.com/docs/hover-focus-and-other-states</w:t>
+        </w:r>
+      </w:hyperlink>
+    </w:p>
+    <w:p>
+      <w:pPr>
+        <w:rPr>
+          <w:sz w:val="40"/>
+          <w:szCs w:val="40"/>
+        </w:rPr>
+      </w:pPr>
+      <w:r>
+        <w:rPr>
+          <w:sz w:val="40"/>
+          <w:szCs w:val="40"/>
+        </w:rPr>
+        <w:t xml:space="preserve">Transition duration: </w:t>
+      </w:r>
+      <w:r>
+        <w:rPr>
+          <w:sz w:val="40"/>
+          <w:szCs w:val="40"/>
+        </w:rPr>
+        <w:t>https://v3.tailwindcss.com/docs/transition-duration</w:t>
+      </w:r>
+    </w:p>
+    <w:p>
+      <w:pPr>
+        <w:rPr>
+          <w:sz w:val="40"/>
+          <w:szCs w:val="40"/>
+        </w:rPr>
+      </w:pPr>
     </w:p>
     <w:sectPr>
       <w:pgSz w:w="12240" w:h="15840"/>
@@ -1716,7 +2737,6 @@
   <w:style w:type="character" w:default="1" w:styleId="DefaultParagraphFont">
     <w:name w:val="Default Paragraph Font"/>
     <w:uiPriority w:val="1"/>
-    <w:semiHidden/>
     <w:unhideWhenUsed/>
   </w:style>
   <w:style w:type="table" w:default="1" w:styleId="TableNormal">
@@ -2028,6 +3048,29 @@
       <w:smallCaps/>
       <w:color w:val="0F4761" w:themeColor="accent1" w:themeShade="BF"/>
       <w:spacing w:val="5"/>
+    </w:rPr>
+  </w:style>
+  <w:style w:type="character" w:styleId="Hyperlink">
+    <w:name w:val="Hyperlink"/>
+    <w:basedOn w:val="DefaultParagraphFont"/>
+    <w:uiPriority w:val="99"/>
+    <w:unhideWhenUsed/>
+    <w:rsid w:val="009435C9"/>
+    <w:rPr>
+      <w:color w:val="467886" w:themeColor="hyperlink"/>
+      <w:u w:val="single"/>
+    </w:rPr>
+  </w:style>
+  <w:style w:type="character" w:styleId="UnresolvedMention">
+    <w:name w:val="Unresolved Mention"/>
+    <w:basedOn w:val="DefaultParagraphFont"/>
+    <w:uiPriority w:val="99"/>
+    <w:semiHidden/>
+    <w:unhideWhenUsed/>
+    <w:rsid w:val="009435C9"/>
+    <w:rPr>
+      <w:color w:val="605E5C"/>
+      <w:shd w:val="clear" w:color="auto" w:fill="E1DFDD"/>
     </w:rPr>
   </w:style>
 </w:styles>

</xml_diff>

<commit_message>
Ultimate React Course: complete section 23
</commit_message>
<xml_diff>
--- a/3.React/UltimateReactCourse/Document/4.docx
+++ b/3.React/UltimateReactCourse/Document/4.docx
@@ -129,22 +129,54 @@
           <w:sz w:val="40"/>
           <w:szCs w:val="40"/>
         </w:rPr>
-        <w:t>+ui: reusable UI components (buttons, inputs…)</w:t>
-      </w:r>
-    </w:p>
-    <w:p>
-      <w:pPr>
-        <w:rPr>
-          <w:sz w:val="40"/>
-          <w:szCs w:val="40"/>
-        </w:rPr>
-      </w:pPr>
-      <w:r>
-        <w:rPr>
-          <w:sz w:val="40"/>
-          <w:szCs w:val="40"/>
-        </w:rPr>
-        <w:t>+utils: helper function reuse in multiple places. These are stateless helper function that don’t create side effects (data or number manipulations,…)</w:t>
+        <w:t>+</w:t>
+      </w:r>
+      <w:proofErr w:type="spellStart"/>
+      <w:r>
+        <w:rPr>
+          <w:sz w:val="40"/>
+          <w:szCs w:val="40"/>
+        </w:rPr>
+        <w:t>ui</w:t>
+      </w:r>
+      <w:proofErr w:type="spellEnd"/>
+      <w:r>
+        <w:rPr>
+          <w:sz w:val="40"/>
+          <w:szCs w:val="40"/>
+        </w:rPr>
+        <w:t>: reusable UI components (buttons, inputs…)</w:t>
+      </w:r>
+    </w:p>
+    <w:p>
+      <w:pPr>
+        <w:rPr>
+          <w:sz w:val="40"/>
+          <w:szCs w:val="40"/>
+        </w:rPr>
+      </w:pPr>
+      <w:r>
+        <w:rPr>
+          <w:sz w:val="40"/>
+          <w:szCs w:val="40"/>
+        </w:rPr>
+        <w:t xml:space="preserve">+utils: helper function reuse in multiple places. These are stateless helper function that don’t create side effects (data or number </w:t>
+      </w:r>
+      <w:proofErr w:type="gramStart"/>
+      <w:r>
+        <w:rPr>
+          <w:sz w:val="40"/>
+          <w:szCs w:val="40"/>
+        </w:rPr>
+        <w:t>manipulations,…</w:t>
+      </w:r>
+      <w:proofErr w:type="gramEnd"/>
+      <w:r>
+        <w:rPr>
+          <w:sz w:val="40"/>
+          <w:szCs w:val="40"/>
+        </w:rPr>
+        <w:t>)</w:t>
       </w:r>
     </w:p>
     <w:p>
@@ -247,12 +279,21 @@
         </w:rPr>
         <w:t>+</w:t>
       </w:r>
-      <w:r>
-        <w:rPr>
-          <w:sz w:val="40"/>
-          <w:szCs w:val="40"/>
-        </w:rPr>
-        <w:t>AppLayout and &lt;Outlet /&gt;</w:t>
+      <w:proofErr w:type="spellStart"/>
+      <w:r>
+        <w:rPr>
+          <w:sz w:val="40"/>
+          <w:szCs w:val="40"/>
+        </w:rPr>
+        <w:t>AppLayout</w:t>
+      </w:r>
+      <w:proofErr w:type="spellEnd"/>
+      <w:r>
+        <w:rPr>
+          <w:sz w:val="40"/>
+          <w:szCs w:val="40"/>
+        </w:rPr>
+        <w:t xml:space="preserve"> and &lt;Outlet /&gt;</w:t>
       </w:r>
     </w:p>
     <w:p>
@@ -1357,7 +1398,23 @@
           <w:sz w:val="40"/>
           <w:szCs w:val="40"/>
         </w:rPr>
-        <w:t xml:space="preserve">Text align: </w:t>
+        <w:t xml:space="preserve">Text </w:t>
+      </w:r>
+      <w:proofErr w:type="gramStart"/>
+      <w:r>
+        <w:rPr>
+          <w:sz w:val="40"/>
+          <w:szCs w:val="40"/>
+        </w:rPr>
+        <w:t>align</w:t>
+      </w:r>
+      <w:proofErr w:type="gramEnd"/>
+      <w:r>
+        <w:rPr>
+          <w:sz w:val="40"/>
+          <w:szCs w:val="40"/>
+        </w:rPr>
+        <w:t xml:space="preserve">: </w:t>
       </w:r>
       <w:hyperlink r:id="rId26" w:history="1">
         <w:r>
@@ -2654,6 +2711,582 @@
           <w:szCs w:val="40"/>
         </w:rPr>
       </w:pPr>
+      <w:r>
+        <w:rPr>
+          <w:sz w:val="40"/>
+          <w:szCs w:val="40"/>
+        </w:rPr>
+        <w:t>+Style the Menu</w:t>
+      </w:r>
+    </w:p>
+    <w:p>
+      <w:pPr>
+        <w:rPr>
+          <w:sz w:val="40"/>
+          <w:szCs w:val="40"/>
+        </w:rPr>
+      </w:pPr>
+      <w:r>
+        <w:rPr>
+          <w:sz w:val="40"/>
+          <w:szCs w:val="40"/>
+        </w:rPr>
+        <w:t xml:space="preserve">Grayscale: </w:t>
+      </w:r>
+      <w:hyperlink r:id="rId61" w:history="1">
+        <w:r>
+          <w:rPr>
+            <w:rStyle w:val="Hyperlink"/>
+            <w:sz w:val="40"/>
+            <w:szCs w:val="40"/>
+          </w:rPr>
+          <w:t>https://v3.tailwindcss.com/docs/grayscale</w:t>
+        </w:r>
+      </w:hyperlink>
+    </w:p>
+    <w:p>
+      <w:pPr>
+        <w:rPr>
+          <w:sz w:val="40"/>
+          <w:szCs w:val="40"/>
+        </w:rPr>
+      </w:pPr>
+      <w:r>
+        <w:rPr>
+          <w:sz w:val="40"/>
+          <w:szCs w:val="40"/>
+        </w:rPr>
+        <w:t>Menu:</w:t>
+      </w:r>
+    </w:p>
+    <w:p>
+      <w:pPr>
+        <w:rPr>
+          <w:sz w:val="40"/>
+          <w:szCs w:val="40"/>
+        </w:rPr>
+      </w:pPr>
+      <w:r>
+        <w:rPr>
+          <w:noProof/>
+        </w:rPr>
+        <w:lastRenderedPageBreak/>
+        <w:drawing>
+          <wp:inline distT="0" distB="0" distL="0" distR="0" wp14:anchorId="46363002" wp14:editId="27DC900C">
+            <wp:extent cx="3657600" cy="1581462"/>
+            <wp:effectExtent l="0" t="0" r="0" b="0"/>
+            <wp:docPr id="658551758" name="Picture 1"/>
+            <wp:cNvGraphicFramePr>
+              <a:graphicFrameLocks xmlns:a="http://schemas.openxmlformats.org/drawingml/2006/main" noChangeAspect="1"/>
+            </wp:cNvGraphicFramePr>
+            <a:graphic xmlns:a="http://schemas.openxmlformats.org/drawingml/2006/main">
+              <a:graphicData uri="http://schemas.openxmlformats.org/drawingml/2006/picture">
+                <pic:pic xmlns:pic="http://schemas.openxmlformats.org/drawingml/2006/picture">
+                  <pic:nvPicPr>
+                    <pic:cNvPr id="658551758" name=""/>
+                    <pic:cNvPicPr/>
+                  </pic:nvPicPr>
+                  <pic:blipFill>
+                    <a:blip r:embed="rId62"/>
+                    <a:stretch>
+                      <a:fillRect/>
+                    </a:stretch>
+                  </pic:blipFill>
+                  <pic:spPr>
+                    <a:xfrm>
+                      <a:off x="0" y="0"/>
+                      <a:ext cx="3662439" cy="1583554"/>
+                    </a:xfrm>
+                    <a:prstGeom prst="rect">
+                      <a:avLst/>
+                    </a:prstGeom>
+                  </pic:spPr>
+                </pic:pic>
+              </a:graphicData>
+            </a:graphic>
+          </wp:inline>
+        </w:drawing>
+      </w:r>
+    </w:p>
+    <w:p>
+      <w:pPr>
+        <w:rPr>
+          <w:sz w:val="40"/>
+          <w:szCs w:val="40"/>
+        </w:rPr>
+      </w:pPr>
+      <w:proofErr w:type="spellStart"/>
+      <w:r>
+        <w:rPr>
+          <w:sz w:val="40"/>
+          <w:szCs w:val="40"/>
+        </w:rPr>
+        <w:t>MenuItem</w:t>
+      </w:r>
+      <w:proofErr w:type="spellEnd"/>
+      <w:r>
+        <w:rPr>
+          <w:sz w:val="40"/>
+          <w:szCs w:val="40"/>
+        </w:rPr>
+        <w:t>:</w:t>
+      </w:r>
+    </w:p>
+    <w:p>
+      <w:pPr>
+        <w:rPr>
+          <w:sz w:val="40"/>
+          <w:szCs w:val="40"/>
+        </w:rPr>
+      </w:pPr>
+      <w:r>
+        <w:rPr>
+          <w:sz w:val="40"/>
+          <w:szCs w:val="40"/>
+        </w:rPr>
+        <w:t xml:space="preserve"> </w:t>
+      </w:r>
+      <w:r>
+        <w:rPr>
+          <w:noProof/>
+        </w:rPr>
+        <w:drawing>
+          <wp:inline distT="0" distB="0" distL="0" distR="0" wp14:anchorId="538EF599" wp14:editId="2E70D53C">
+            <wp:extent cx="3533775" cy="2513916"/>
+            <wp:effectExtent l="0" t="0" r="0" b="1270"/>
+            <wp:docPr id="149890726" name="Picture 1"/>
+            <wp:cNvGraphicFramePr>
+              <a:graphicFrameLocks xmlns:a="http://schemas.openxmlformats.org/drawingml/2006/main" noChangeAspect="1"/>
+            </wp:cNvGraphicFramePr>
+            <a:graphic xmlns:a="http://schemas.openxmlformats.org/drawingml/2006/main">
+              <a:graphicData uri="http://schemas.openxmlformats.org/drawingml/2006/picture">
+                <pic:pic xmlns:pic="http://schemas.openxmlformats.org/drawingml/2006/picture">
+                  <pic:nvPicPr>
+                    <pic:cNvPr id="149890726" name=""/>
+                    <pic:cNvPicPr/>
+                  </pic:nvPicPr>
+                  <pic:blipFill>
+                    <a:blip r:embed="rId63"/>
+                    <a:stretch>
+                      <a:fillRect/>
+                    </a:stretch>
+                  </pic:blipFill>
+                  <pic:spPr>
+                    <a:xfrm>
+                      <a:off x="0" y="0"/>
+                      <a:ext cx="3548293" cy="2524244"/>
+                    </a:xfrm>
+                    <a:prstGeom prst="rect">
+                      <a:avLst/>
+                    </a:prstGeom>
+                  </pic:spPr>
+                </pic:pic>
+              </a:graphicData>
+            </a:graphic>
+          </wp:inline>
+        </w:drawing>
+      </w:r>
+    </w:p>
+    <w:p>
+      <w:pPr>
+        <w:rPr>
+          <w:sz w:val="40"/>
+          <w:szCs w:val="40"/>
+        </w:rPr>
+      </w:pPr>
+      <w:r>
+        <w:rPr>
+          <w:sz w:val="40"/>
+          <w:szCs w:val="40"/>
+        </w:rPr>
+        <w:t>+Style the Cart</w:t>
+      </w:r>
+    </w:p>
+    <w:p>
+      <w:pPr>
+        <w:rPr>
+          <w:sz w:val="40"/>
+          <w:szCs w:val="40"/>
+        </w:rPr>
+      </w:pPr>
+      <w:r>
+        <w:rPr>
+          <w:sz w:val="40"/>
+          <w:szCs w:val="40"/>
+        </w:rPr>
+        <w:t>Cart</w:t>
+      </w:r>
+    </w:p>
+    <w:p>
+      <w:pPr>
+        <w:rPr>
+          <w:sz w:val="40"/>
+          <w:szCs w:val="40"/>
+        </w:rPr>
+      </w:pPr>
+      <w:r>
+        <w:rPr>
+          <w:noProof/>
+        </w:rPr>
+        <w:drawing>
+          <wp:inline distT="0" distB="0" distL="0" distR="0" wp14:anchorId="3AFD0D48" wp14:editId="1706AD4B">
+            <wp:extent cx="3448050" cy="2283169"/>
+            <wp:effectExtent l="0" t="0" r="0" b="3175"/>
+            <wp:docPr id="2089899700" name="Picture 1"/>
+            <wp:cNvGraphicFramePr>
+              <a:graphicFrameLocks xmlns:a="http://schemas.openxmlformats.org/drawingml/2006/main" noChangeAspect="1"/>
+            </wp:cNvGraphicFramePr>
+            <a:graphic xmlns:a="http://schemas.openxmlformats.org/drawingml/2006/main">
+              <a:graphicData uri="http://schemas.openxmlformats.org/drawingml/2006/picture">
+                <pic:pic xmlns:pic="http://schemas.openxmlformats.org/drawingml/2006/picture">
+                  <pic:nvPicPr>
+                    <pic:cNvPr id="2089899700" name=""/>
+                    <pic:cNvPicPr/>
+                  </pic:nvPicPr>
+                  <pic:blipFill>
+                    <a:blip r:embed="rId64"/>
+                    <a:stretch>
+                      <a:fillRect/>
+                    </a:stretch>
+                  </pic:blipFill>
+                  <pic:spPr>
+                    <a:xfrm>
+                      <a:off x="0" y="0"/>
+                      <a:ext cx="3453732" cy="2286932"/>
+                    </a:xfrm>
+                    <a:prstGeom prst="rect">
+                      <a:avLst/>
+                    </a:prstGeom>
+                  </pic:spPr>
+                </pic:pic>
+              </a:graphicData>
+            </a:graphic>
+          </wp:inline>
+        </w:drawing>
+      </w:r>
+    </w:p>
+    <w:p>
+      <w:pPr>
+        <w:rPr>
+          <w:sz w:val="40"/>
+          <w:szCs w:val="40"/>
+        </w:rPr>
+      </w:pPr>
+      <w:proofErr w:type="spellStart"/>
+      <w:r>
+        <w:rPr>
+          <w:sz w:val="40"/>
+          <w:szCs w:val="40"/>
+        </w:rPr>
+        <w:lastRenderedPageBreak/>
+        <w:t>CartItem</w:t>
+      </w:r>
+      <w:proofErr w:type="spellEnd"/>
+      <w:r>
+        <w:rPr>
+          <w:sz w:val="40"/>
+          <w:szCs w:val="40"/>
+        </w:rPr>
+        <w:t>:</w:t>
+      </w:r>
+    </w:p>
+    <w:p>
+      <w:pPr>
+        <w:rPr>
+          <w:sz w:val="40"/>
+          <w:szCs w:val="40"/>
+        </w:rPr>
+      </w:pPr>
+      <w:r>
+        <w:rPr>
+          <w:noProof/>
+        </w:rPr>
+        <w:drawing>
+          <wp:inline distT="0" distB="0" distL="0" distR="0" wp14:anchorId="1FC5AC95" wp14:editId="4435E2FA">
+            <wp:extent cx="4133573" cy="1323975"/>
+            <wp:effectExtent l="0" t="0" r="635" b="0"/>
+            <wp:docPr id="1089736772" name="Picture 1"/>
+            <wp:cNvGraphicFramePr>
+              <a:graphicFrameLocks xmlns:a="http://schemas.openxmlformats.org/drawingml/2006/main" noChangeAspect="1"/>
+            </wp:cNvGraphicFramePr>
+            <a:graphic xmlns:a="http://schemas.openxmlformats.org/drawingml/2006/main">
+              <a:graphicData uri="http://schemas.openxmlformats.org/drawingml/2006/picture">
+                <pic:pic xmlns:pic="http://schemas.openxmlformats.org/drawingml/2006/picture">
+                  <pic:nvPicPr>
+                    <pic:cNvPr id="1089736772" name=""/>
+                    <pic:cNvPicPr/>
+                  </pic:nvPicPr>
+                  <pic:blipFill>
+                    <a:blip r:embed="rId65"/>
+                    <a:stretch>
+                      <a:fillRect/>
+                    </a:stretch>
+                  </pic:blipFill>
+                  <pic:spPr>
+                    <a:xfrm>
+                      <a:off x="0" y="0"/>
+                      <a:ext cx="4160087" cy="1332467"/>
+                    </a:xfrm>
+                    <a:prstGeom prst="rect">
+                      <a:avLst/>
+                    </a:prstGeom>
+                  </pic:spPr>
+                </pic:pic>
+              </a:graphicData>
+            </a:graphic>
+          </wp:inline>
+        </w:drawing>
+      </w:r>
+    </w:p>
+    <w:p>
+      <w:pPr>
+        <w:rPr>
+          <w:sz w:val="40"/>
+          <w:szCs w:val="40"/>
+        </w:rPr>
+      </w:pPr>
+      <w:r>
+        <w:rPr>
+          <w:sz w:val="40"/>
+          <w:szCs w:val="40"/>
+        </w:rPr>
+        <w:t>+Style the Order</w:t>
+      </w:r>
+    </w:p>
+    <w:p>
+      <w:pPr>
+        <w:rPr>
+          <w:sz w:val="40"/>
+          <w:szCs w:val="40"/>
+        </w:rPr>
+      </w:pPr>
+      <w:r>
+        <w:rPr>
+          <w:sz w:val="40"/>
+          <w:szCs w:val="40"/>
+        </w:rPr>
+        <w:t xml:space="preserve">Gap: </w:t>
+      </w:r>
+      <w:hyperlink r:id="rId66" w:history="1">
+        <w:r>
+          <w:rPr>
+            <w:rStyle w:val="Hyperlink"/>
+            <w:sz w:val="40"/>
+            <w:szCs w:val="40"/>
+          </w:rPr>
+          <w:t>https://v3.tailwindcss.com/docs/gap</w:t>
+        </w:r>
+      </w:hyperlink>
+    </w:p>
+    <w:p>
+      <w:pPr>
+        <w:rPr>
+          <w:sz w:val="40"/>
+          <w:szCs w:val="40"/>
+        </w:rPr>
+      </w:pPr>
+      <w:r>
+        <w:rPr>
+          <w:sz w:val="40"/>
+          <w:szCs w:val="40"/>
+        </w:rPr>
+        <w:t xml:space="preserve">Flex Basis: </w:t>
+      </w:r>
+      <w:hyperlink r:id="rId67" w:history="1">
+        <w:r>
+          <w:rPr>
+            <w:rStyle w:val="Hyperlink"/>
+            <w:sz w:val="40"/>
+            <w:szCs w:val="40"/>
+          </w:rPr>
+          <w:t>https://v3.tailwindcss.com/docs/flex-basis</w:t>
+        </w:r>
+      </w:hyperlink>
+    </w:p>
+    <w:p>
+      <w:pPr>
+        <w:rPr>
+          <w:sz w:val="40"/>
+          <w:szCs w:val="40"/>
+        </w:rPr>
+      </w:pPr>
+      <w:r>
+        <w:rPr>
+          <w:sz w:val="40"/>
+          <w:szCs w:val="40"/>
+        </w:rPr>
+        <w:t xml:space="preserve">Flew Grow: </w:t>
+      </w:r>
+      <w:hyperlink r:id="rId68" w:history="1">
+        <w:r>
+          <w:rPr>
+            <w:rStyle w:val="Hyperlink"/>
+            <w:sz w:val="40"/>
+            <w:szCs w:val="40"/>
+          </w:rPr>
+          <w:t>https://v3.tailwindcss.com/docs/flex-grow</w:t>
+        </w:r>
+      </w:hyperlink>
+    </w:p>
+    <w:p>
+      <w:pPr>
+        <w:rPr>
+          <w:sz w:val="40"/>
+          <w:szCs w:val="40"/>
+        </w:rPr>
+      </w:pPr>
+      <w:r>
+        <w:rPr>
+          <w:noProof/>
+        </w:rPr>
+        <w:drawing>
+          <wp:inline distT="0" distB="0" distL="0" distR="0" wp14:anchorId="41B3A638" wp14:editId="7DAB1D95">
+            <wp:extent cx="4019550" cy="2199376"/>
+            <wp:effectExtent l="0" t="0" r="0" b="0"/>
+            <wp:docPr id="166962087" name="Picture 1"/>
+            <wp:cNvGraphicFramePr>
+              <a:graphicFrameLocks xmlns:a="http://schemas.openxmlformats.org/drawingml/2006/main" noChangeAspect="1"/>
+            </wp:cNvGraphicFramePr>
+            <a:graphic xmlns:a="http://schemas.openxmlformats.org/drawingml/2006/main">
+              <a:graphicData uri="http://schemas.openxmlformats.org/drawingml/2006/picture">
+                <pic:pic xmlns:pic="http://schemas.openxmlformats.org/drawingml/2006/picture">
+                  <pic:nvPicPr>
+                    <pic:cNvPr id="166962087" name=""/>
+                    <pic:cNvPicPr/>
+                  </pic:nvPicPr>
+                  <pic:blipFill>
+                    <a:blip r:embed="rId69"/>
+                    <a:stretch>
+                      <a:fillRect/>
+                    </a:stretch>
+                  </pic:blipFill>
+                  <pic:spPr>
+                    <a:xfrm>
+                      <a:off x="0" y="0"/>
+                      <a:ext cx="4032852" cy="2206654"/>
+                    </a:xfrm>
+                    <a:prstGeom prst="rect">
+                      <a:avLst/>
+                    </a:prstGeom>
+                  </pic:spPr>
+                </pic:pic>
+              </a:graphicData>
+            </a:graphic>
+          </wp:inline>
+        </w:drawing>
+      </w:r>
+    </w:p>
+    <w:p>
+      <w:pPr>
+        <w:rPr>
+          <w:sz w:val="40"/>
+          <w:szCs w:val="40"/>
+        </w:rPr>
+      </w:pPr>
+      <w:r>
+        <w:rPr>
+          <w:sz w:val="40"/>
+          <w:szCs w:val="40"/>
+        </w:rPr>
+        <w:t>+Style the Order Overview</w:t>
+      </w:r>
+    </w:p>
+    <w:p>
+      <w:pPr>
+        <w:rPr>
+          <w:sz w:val="40"/>
+          <w:szCs w:val="40"/>
+        </w:rPr>
+      </w:pPr>
+      <w:r>
+        <w:rPr>
+          <w:noProof/>
+        </w:rPr>
+        <w:lastRenderedPageBreak/>
+        <w:drawing>
+          <wp:inline distT="0" distB="0" distL="0" distR="0" wp14:anchorId="748BA670" wp14:editId="3DF16ED2">
+            <wp:extent cx="4495800" cy="2089394"/>
+            <wp:effectExtent l="0" t="0" r="0" b="6350"/>
+            <wp:docPr id="925437318" name="Picture 1"/>
+            <wp:cNvGraphicFramePr>
+              <a:graphicFrameLocks xmlns:a="http://schemas.openxmlformats.org/drawingml/2006/main" noChangeAspect="1"/>
+            </wp:cNvGraphicFramePr>
+            <a:graphic xmlns:a="http://schemas.openxmlformats.org/drawingml/2006/main">
+              <a:graphicData uri="http://schemas.openxmlformats.org/drawingml/2006/picture">
+                <pic:pic xmlns:pic="http://schemas.openxmlformats.org/drawingml/2006/picture">
+                  <pic:nvPicPr>
+                    <pic:cNvPr id="925437318" name=""/>
+                    <pic:cNvPicPr/>
+                  </pic:nvPicPr>
+                  <pic:blipFill>
+                    <a:blip r:embed="rId70"/>
+                    <a:stretch>
+                      <a:fillRect/>
+                    </a:stretch>
+                  </pic:blipFill>
+                  <pic:spPr>
+                    <a:xfrm>
+                      <a:off x="0" y="0"/>
+                      <a:ext cx="4513610" cy="2097671"/>
+                    </a:xfrm>
+                    <a:prstGeom prst="rect">
+                      <a:avLst/>
+                    </a:prstGeom>
+                  </pic:spPr>
+                </pic:pic>
+              </a:graphicData>
+            </a:graphic>
+          </wp:inline>
+        </w:drawing>
+      </w:r>
+    </w:p>
+    <w:p>
+      <w:pPr>
+        <w:rPr>
+          <w:sz w:val="40"/>
+          <w:szCs w:val="40"/>
+        </w:rPr>
+      </w:pPr>
+      <w:r>
+        <w:rPr>
+          <w:noProof/>
+        </w:rPr>
+        <w:drawing>
+          <wp:inline distT="0" distB="0" distL="0" distR="0" wp14:anchorId="18F8C9FC" wp14:editId="799942F1">
+            <wp:extent cx="3790950" cy="2524888"/>
+            <wp:effectExtent l="0" t="0" r="0" b="8890"/>
+            <wp:docPr id="2045627876" name="Picture 1"/>
+            <wp:cNvGraphicFramePr>
+              <a:graphicFrameLocks xmlns:a="http://schemas.openxmlformats.org/drawingml/2006/main" noChangeAspect="1"/>
+            </wp:cNvGraphicFramePr>
+            <a:graphic xmlns:a="http://schemas.openxmlformats.org/drawingml/2006/main">
+              <a:graphicData uri="http://schemas.openxmlformats.org/drawingml/2006/picture">
+                <pic:pic xmlns:pic="http://schemas.openxmlformats.org/drawingml/2006/picture">
+                  <pic:nvPicPr>
+                    <pic:cNvPr id="2045627876" name=""/>
+                    <pic:cNvPicPr/>
+                  </pic:nvPicPr>
+                  <pic:blipFill>
+                    <a:blip r:embed="rId71"/>
+                    <a:stretch>
+                      <a:fillRect/>
+                    </a:stretch>
+                  </pic:blipFill>
+                  <pic:spPr>
+                    <a:xfrm>
+                      <a:off x="0" y="0"/>
+                      <a:ext cx="3797040" cy="2528944"/>
+                    </a:xfrm>
+                    <a:prstGeom prst="rect">
+                      <a:avLst/>
+                    </a:prstGeom>
+                  </pic:spPr>
+                </pic:pic>
+              </a:graphicData>
+            </a:graphic>
+          </wp:inline>
+        </w:drawing>
+      </w:r>
     </w:p>
     <w:sectPr>
       <w:pgSz w:w="12240" w:h="15840"/>

</xml_diff>

<commit_message>
Ultimate React Course: Update section 24
</commit_message>
<xml_diff>
--- a/3.React/UltimateReactCourse/Document/4.docx
+++ b/3.React/UltimateReactCourse/Document/4.docx
@@ -3287,6 +3287,1200 @@
           </wp:inline>
         </w:drawing>
       </w:r>
+    </w:p>
+    <w:p>
+      <w:pPr>
+        <w:rPr>
+          <w:sz w:val="40"/>
+          <w:szCs w:val="40"/>
+        </w:rPr>
+      </w:pPr>
+      <w:r>
+        <w:rPr>
+          <w:sz w:val="40"/>
+          <w:szCs w:val="40"/>
+        </w:rPr>
+        <w:t>-Add Redux and advanced React Router</w:t>
+      </w:r>
+    </w:p>
+    <w:p>
+      <w:pPr>
+        <w:rPr>
+          <w:sz w:val="40"/>
+          <w:szCs w:val="40"/>
+        </w:rPr>
+      </w:pPr>
+      <w:r>
+        <w:rPr>
+          <w:sz w:val="40"/>
+          <w:szCs w:val="40"/>
+        </w:rPr>
+        <w:t>+Model User state with Redux Toolkit</w:t>
+      </w:r>
+    </w:p>
+    <w:p>
+      <w:pPr>
+        <w:rPr>
+          <w:sz w:val="40"/>
+          <w:szCs w:val="40"/>
+        </w:rPr>
+      </w:pPr>
+      <w:proofErr w:type="spellStart"/>
+      <w:r>
+        <w:rPr>
+          <w:sz w:val="40"/>
+          <w:szCs w:val="40"/>
+        </w:rPr>
+        <w:t>userSlice</w:t>
+      </w:r>
+      <w:proofErr w:type="spellEnd"/>
+      <w:r>
+        <w:rPr>
+          <w:sz w:val="40"/>
+          <w:szCs w:val="40"/>
+        </w:rPr>
+        <w:t>:</w:t>
+      </w:r>
+    </w:p>
+    <w:p>
+      <w:pPr>
+        <w:rPr>
+          <w:sz w:val="40"/>
+          <w:szCs w:val="40"/>
+        </w:rPr>
+      </w:pPr>
+      <w:r>
+        <w:rPr>
+          <w:noProof/>
+        </w:rPr>
+        <w:lastRenderedPageBreak/>
+        <w:drawing>
+          <wp:inline distT="0" distB="0" distL="0" distR="0" wp14:anchorId="242E177C" wp14:editId="580D1630">
+            <wp:extent cx="2754736" cy="2371725"/>
+            <wp:effectExtent l="0" t="0" r="7620" b="0"/>
+            <wp:docPr id="1041235740" name="Picture 1"/>
+            <wp:cNvGraphicFramePr>
+              <a:graphicFrameLocks xmlns:a="http://schemas.openxmlformats.org/drawingml/2006/main" noChangeAspect="1"/>
+            </wp:cNvGraphicFramePr>
+            <a:graphic xmlns:a="http://schemas.openxmlformats.org/drawingml/2006/main">
+              <a:graphicData uri="http://schemas.openxmlformats.org/drawingml/2006/picture">
+                <pic:pic xmlns:pic="http://schemas.openxmlformats.org/drawingml/2006/picture">
+                  <pic:nvPicPr>
+                    <pic:cNvPr id="1041235740" name=""/>
+                    <pic:cNvPicPr/>
+                  </pic:nvPicPr>
+                  <pic:blipFill>
+                    <a:blip r:embed="rId72"/>
+                    <a:stretch>
+                      <a:fillRect/>
+                    </a:stretch>
+                  </pic:blipFill>
+                  <pic:spPr>
+                    <a:xfrm>
+                      <a:off x="0" y="0"/>
+                      <a:ext cx="2764374" cy="2380023"/>
+                    </a:xfrm>
+                    <a:prstGeom prst="rect">
+                      <a:avLst/>
+                    </a:prstGeom>
+                  </pic:spPr>
+                </pic:pic>
+              </a:graphicData>
+            </a:graphic>
+          </wp:inline>
+        </w:drawing>
+      </w:r>
+    </w:p>
+    <w:p>
+      <w:pPr>
+        <w:rPr>
+          <w:sz w:val="40"/>
+          <w:szCs w:val="40"/>
+        </w:rPr>
+      </w:pPr>
+      <w:r>
+        <w:rPr>
+          <w:sz w:val="40"/>
+          <w:szCs w:val="40"/>
+        </w:rPr>
+        <w:t>store.js</w:t>
+      </w:r>
+    </w:p>
+    <w:p>
+      <w:pPr>
+        <w:rPr>
+          <w:sz w:val="40"/>
+          <w:szCs w:val="40"/>
+        </w:rPr>
+      </w:pPr>
+      <w:r>
+        <w:rPr>
+          <w:noProof/>
+        </w:rPr>
+        <w:drawing>
+          <wp:inline distT="0" distB="0" distL="0" distR="0" wp14:anchorId="445AA2B7" wp14:editId="09F160DD">
+            <wp:extent cx="1885950" cy="1071929"/>
+            <wp:effectExtent l="0" t="0" r="0" b="0"/>
+            <wp:docPr id="1103533801" name="Picture 1"/>
+            <wp:cNvGraphicFramePr>
+              <a:graphicFrameLocks xmlns:a="http://schemas.openxmlformats.org/drawingml/2006/main" noChangeAspect="1"/>
+            </wp:cNvGraphicFramePr>
+            <a:graphic xmlns:a="http://schemas.openxmlformats.org/drawingml/2006/main">
+              <a:graphicData uri="http://schemas.openxmlformats.org/drawingml/2006/picture">
+                <pic:pic xmlns:pic="http://schemas.openxmlformats.org/drawingml/2006/picture">
+                  <pic:nvPicPr>
+                    <pic:cNvPr id="1103533801" name=""/>
+                    <pic:cNvPicPr/>
+                  </pic:nvPicPr>
+                  <pic:blipFill>
+                    <a:blip r:embed="rId73"/>
+                    <a:stretch>
+                      <a:fillRect/>
+                    </a:stretch>
+                  </pic:blipFill>
+                  <pic:spPr>
+                    <a:xfrm>
+                      <a:off x="0" y="0"/>
+                      <a:ext cx="1890264" cy="1074381"/>
+                    </a:xfrm>
+                    <a:prstGeom prst="rect">
+                      <a:avLst/>
+                    </a:prstGeom>
+                  </pic:spPr>
+                </pic:pic>
+              </a:graphicData>
+            </a:graphic>
+          </wp:inline>
+        </w:drawing>
+      </w:r>
+    </w:p>
+    <w:p>
+      <w:pPr>
+        <w:rPr>
+          <w:sz w:val="40"/>
+          <w:szCs w:val="40"/>
+        </w:rPr>
+      </w:pPr>
+      <w:proofErr w:type="spellStart"/>
+      <w:r>
+        <w:rPr>
+          <w:sz w:val="40"/>
+          <w:szCs w:val="40"/>
+        </w:rPr>
+        <w:t>main.jsx</w:t>
+      </w:r>
+      <w:proofErr w:type="spellEnd"/>
+    </w:p>
+    <w:p>
+      <w:pPr>
+        <w:rPr>
+          <w:sz w:val="40"/>
+          <w:szCs w:val="40"/>
+        </w:rPr>
+      </w:pPr>
+      <w:r>
+        <w:rPr>
+          <w:noProof/>
+        </w:rPr>
+        <w:drawing>
+          <wp:inline distT="0" distB="0" distL="0" distR="0" wp14:anchorId="711E790C" wp14:editId="69098516">
+            <wp:extent cx="1781175" cy="837152"/>
+            <wp:effectExtent l="0" t="0" r="0" b="1270"/>
+            <wp:docPr id="220306484" name="Picture 1"/>
+            <wp:cNvGraphicFramePr>
+              <a:graphicFrameLocks xmlns:a="http://schemas.openxmlformats.org/drawingml/2006/main" noChangeAspect="1"/>
+            </wp:cNvGraphicFramePr>
+            <a:graphic xmlns:a="http://schemas.openxmlformats.org/drawingml/2006/main">
+              <a:graphicData uri="http://schemas.openxmlformats.org/drawingml/2006/picture">
+                <pic:pic xmlns:pic="http://schemas.openxmlformats.org/drawingml/2006/picture">
+                  <pic:nvPicPr>
+                    <pic:cNvPr id="220306484" name=""/>
+                    <pic:cNvPicPr/>
+                  </pic:nvPicPr>
+                  <pic:blipFill>
+                    <a:blip r:embed="rId74"/>
+                    <a:stretch>
+                      <a:fillRect/>
+                    </a:stretch>
+                  </pic:blipFill>
+                  <pic:spPr>
+                    <a:xfrm>
+                      <a:off x="0" y="0"/>
+                      <a:ext cx="1782978" cy="837999"/>
+                    </a:xfrm>
+                    <a:prstGeom prst="rect">
+                      <a:avLst/>
+                    </a:prstGeom>
+                  </pic:spPr>
+                </pic:pic>
+              </a:graphicData>
+            </a:graphic>
+          </wp:inline>
+        </w:drawing>
+      </w:r>
+    </w:p>
+    <w:p>
+      <w:pPr>
+        <w:rPr>
+          <w:sz w:val="40"/>
+          <w:szCs w:val="40"/>
+        </w:rPr>
+      </w:pPr>
+      <w:r>
+        <w:rPr>
+          <w:sz w:val="40"/>
+          <w:szCs w:val="40"/>
+        </w:rPr>
+        <w:t xml:space="preserve">Used in </w:t>
+      </w:r>
+      <w:proofErr w:type="spellStart"/>
+      <w:r>
+        <w:rPr>
+          <w:sz w:val="40"/>
+          <w:szCs w:val="40"/>
+        </w:rPr>
+        <w:t>Username.jsx</w:t>
+      </w:r>
+      <w:proofErr w:type="spellEnd"/>
+      <w:r>
+        <w:rPr>
+          <w:sz w:val="40"/>
+          <w:szCs w:val="40"/>
+        </w:rPr>
+        <w:t>:</w:t>
+      </w:r>
+    </w:p>
+    <w:p>
+      <w:pPr>
+        <w:rPr>
+          <w:sz w:val="40"/>
+          <w:szCs w:val="40"/>
+        </w:rPr>
+      </w:pPr>
+      <w:r>
+        <w:rPr>
+          <w:noProof/>
+        </w:rPr>
+        <w:drawing>
+          <wp:inline distT="0" distB="0" distL="0" distR="0" wp14:anchorId="36498C12" wp14:editId="16515D86">
+            <wp:extent cx="4619625" cy="1378756"/>
+            <wp:effectExtent l="0" t="0" r="0" b="0"/>
+            <wp:docPr id="1117604763" name="Picture 1"/>
+            <wp:cNvGraphicFramePr>
+              <a:graphicFrameLocks xmlns:a="http://schemas.openxmlformats.org/drawingml/2006/main" noChangeAspect="1"/>
+            </wp:cNvGraphicFramePr>
+            <a:graphic xmlns:a="http://schemas.openxmlformats.org/drawingml/2006/main">
+              <a:graphicData uri="http://schemas.openxmlformats.org/drawingml/2006/picture">
+                <pic:pic xmlns:pic="http://schemas.openxmlformats.org/drawingml/2006/picture">
+                  <pic:nvPicPr>
+                    <pic:cNvPr id="1117604763" name=""/>
+                    <pic:cNvPicPr/>
+                  </pic:nvPicPr>
+                  <pic:blipFill>
+                    <a:blip r:embed="rId75"/>
+                    <a:stretch>
+                      <a:fillRect/>
+                    </a:stretch>
+                  </pic:blipFill>
+                  <pic:spPr>
+                    <a:xfrm>
+                      <a:off x="0" y="0"/>
+                      <a:ext cx="4632620" cy="1382634"/>
+                    </a:xfrm>
+                    <a:prstGeom prst="rect">
+                      <a:avLst/>
+                    </a:prstGeom>
+                  </pic:spPr>
+                </pic:pic>
+              </a:graphicData>
+            </a:graphic>
+          </wp:inline>
+        </w:drawing>
+      </w:r>
+    </w:p>
+    <w:p>
+      <w:pPr>
+        <w:rPr>
+          <w:sz w:val="40"/>
+          <w:szCs w:val="40"/>
+        </w:rPr>
+      </w:pPr>
+      <w:r>
+        <w:rPr>
+          <w:sz w:val="40"/>
+          <w:szCs w:val="40"/>
+        </w:rPr>
+        <w:t>+Read and update User State</w:t>
+      </w:r>
+    </w:p>
+    <w:p>
+      <w:pPr>
+        <w:rPr>
+          <w:sz w:val="40"/>
+          <w:szCs w:val="40"/>
+        </w:rPr>
+      </w:pPr>
+      <w:r>
+        <w:rPr>
+          <w:noProof/>
+        </w:rPr>
+        <w:lastRenderedPageBreak/>
+        <w:drawing>
+          <wp:inline distT="0" distB="0" distL="0" distR="0" wp14:anchorId="6AB72BB1" wp14:editId="5A7C74DE">
+            <wp:extent cx="3209925" cy="1600364"/>
+            <wp:effectExtent l="0" t="0" r="0" b="0"/>
+            <wp:docPr id="1195612248" name="Picture 1"/>
+            <wp:cNvGraphicFramePr>
+              <a:graphicFrameLocks xmlns:a="http://schemas.openxmlformats.org/drawingml/2006/main" noChangeAspect="1"/>
+            </wp:cNvGraphicFramePr>
+            <a:graphic xmlns:a="http://schemas.openxmlformats.org/drawingml/2006/main">
+              <a:graphicData uri="http://schemas.openxmlformats.org/drawingml/2006/picture">
+                <pic:pic xmlns:pic="http://schemas.openxmlformats.org/drawingml/2006/picture">
+                  <pic:nvPicPr>
+                    <pic:cNvPr id="1195612248" name=""/>
+                    <pic:cNvPicPr/>
+                  </pic:nvPicPr>
+                  <pic:blipFill>
+                    <a:blip r:embed="rId76"/>
+                    <a:stretch>
+                      <a:fillRect/>
+                    </a:stretch>
+                  </pic:blipFill>
+                  <pic:spPr>
+                    <a:xfrm>
+                      <a:off x="0" y="0"/>
+                      <a:ext cx="3220334" cy="1605554"/>
+                    </a:xfrm>
+                    <a:prstGeom prst="rect">
+                      <a:avLst/>
+                    </a:prstGeom>
+                  </pic:spPr>
+                </pic:pic>
+              </a:graphicData>
+            </a:graphic>
+          </wp:inline>
+        </w:drawing>
+      </w:r>
+    </w:p>
+    <w:p>
+      <w:pPr>
+        <w:rPr>
+          <w:sz w:val="40"/>
+          <w:szCs w:val="40"/>
+        </w:rPr>
+      </w:pPr>
+      <w:r>
+        <w:rPr>
+          <w:sz w:val="40"/>
+          <w:szCs w:val="40"/>
+        </w:rPr>
+        <w:t>+Model the Cart State</w:t>
+      </w:r>
+    </w:p>
+    <w:p>
+      <w:pPr>
+        <w:rPr>
+          <w:sz w:val="40"/>
+          <w:szCs w:val="40"/>
+        </w:rPr>
+      </w:pPr>
+      <w:proofErr w:type="spellStart"/>
+      <w:r>
+        <w:rPr>
+          <w:sz w:val="40"/>
+          <w:szCs w:val="40"/>
+        </w:rPr>
+        <w:t>cartSlide</w:t>
+      </w:r>
+      <w:proofErr w:type="spellEnd"/>
+      <w:r>
+        <w:rPr>
+          <w:sz w:val="40"/>
+          <w:szCs w:val="40"/>
+        </w:rPr>
+        <w:t>:</w:t>
+      </w:r>
+    </w:p>
+    <w:p>
+      <w:pPr>
+        <w:rPr>
+          <w:sz w:val="40"/>
+          <w:szCs w:val="40"/>
+        </w:rPr>
+      </w:pPr>
+      <w:r>
+        <w:rPr>
+          <w:noProof/>
+        </w:rPr>
+        <w:drawing>
+          <wp:inline distT="0" distB="0" distL="0" distR="0" wp14:anchorId="535AB075" wp14:editId="10DC63F0">
+            <wp:extent cx="1504950" cy="1429359"/>
+            <wp:effectExtent l="0" t="0" r="0" b="0"/>
+            <wp:docPr id="170527128" name="Picture 1"/>
+            <wp:cNvGraphicFramePr>
+              <a:graphicFrameLocks xmlns:a="http://schemas.openxmlformats.org/drawingml/2006/main" noChangeAspect="1"/>
+            </wp:cNvGraphicFramePr>
+            <a:graphic xmlns:a="http://schemas.openxmlformats.org/drawingml/2006/main">
+              <a:graphicData uri="http://schemas.openxmlformats.org/drawingml/2006/picture">
+                <pic:pic xmlns:pic="http://schemas.openxmlformats.org/drawingml/2006/picture">
+                  <pic:nvPicPr>
+                    <pic:cNvPr id="170527128" name=""/>
+                    <pic:cNvPicPr/>
+                  </pic:nvPicPr>
+                  <pic:blipFill>
+                    <a:blip r:embed="rId77"/>
+                    <a:stretch>
+                      <a:fillRect/>
+                    </a:stretch>
+                  </pic:blipFill>
+                  <pic:spPr>
+                    <a:xfrm>
+                      <a:off x="0" y="0"/>
+                      <a:ext cx="1509706" cy="1433876"/>
+                    </a:xfrm>
+                    <a:prstGeom prst="rect">
+                      <a:avLst/>
+                    </a:prstGeom>
+                  </pic:spPr>
+                </pic:pic>
+              </a:graphicData>
+            </a:graphic>
+          </wp:inline>
+        </w:drawing>
+      </w:r>
+    </w:p>
+    <w:p>
+      <w:pPr>
+        <w:rPr>
+          <w:sz w:val="40"/>
+          <w:szCs w:val="40"/>
+        </w:rPr>
+      </w:pPr>
+      <w:r>
+        <w:rPr>
+          <w:noProof/>
+        </w:rPr>
+        <w:drawing>
+          <wp:inline distT="0" distB="0" distL="0" distR="0" wp14:anchorId="4EA0715B" wp14:editId="3298C145">
+            <wp:extent cx="4076700" cy="3193080"/>
+            <wp:effectExtent l="0" t="0" r="0" b="7620"/>
+            <wp:docPr id="1542273950" name="Picture 1"/>
+            <wp:cNvGraphicFramePr>
+              <a:graphicFrameLocks xmlns:a="http://schemas.openxmlformats.org/drawingml/2006/main" noChangeAspect="1"/>
+            </wp:cNvGraphicFramePr>
+            <a:graphic xmlns:a="http://schemas.openxmlformats.org/drawingml/2006/main">
+              <a:graphicData uri="http://schemas.openxmlformats.org/drawingml/2006/picture">
+                <pic:pic xmlns:pic="http://schemas.openxmlformats.org/drawingml/2006/picture">
+                  <pic:nvPicPr>
+                    <pic:cNvPr id="1542273950" name=""/>
+                    <pic:cNvPicPr/>
+                  </pic:nvPicPr>
+                  <pic:blipFill>
+                    <a:blip r:embed="rId78"/>
+                    <a:stretch>
+                      <a:fillRect/>
+                    </a:stretch>
+                  </pic:blipFill>
+                  <pic:spPr>
+                    <a:xfrm>
+                      <a:off x="0" y="0"/>
+                      <a:ext cx="4078495" cy="3194486"/>
+                    </a:xfrm>
+                    <a:prstGeom prst="rect">
+                      <a:avLst/>
+                    </a:prstGeom>
+                  </pic:spPr>
+                </pic:pic>
+              </a:graphicData>
+            </a:graphic>
+          </wp:inline>
+        </w:drawing>
+      </w:r>
+    </w:p>
+    <w:p>
+      <w:pPr>
+        <w:rPr>
+          <w:sz w:val="40"/>
+          <w:szCs w:val="40"/>
+        </w:rPr>
+      </w:pPr>
+      <w:r>
+        <w:rPr>
+          <w:noProof/>
+        </w:rPr>
+        <w:lastRenderedPageBreak/>
+        <w:drawing>
+          <wp:inline distT="0" distB="0" distL="0" distR="0" wp14:anchorId="17C67F21" wp14:editId="16DB69E9">
+            <wp:extent cx="2015556" cy="1362075"/>
+            <wp:effectExtent l="0" t="0" r="3810" b="0"/>
+            <wp:docPr id="1863264551" name="Picture 1"/>
+            <wp:cNvGraphicFramePr>
+              <a:graphicFrameLocks xmlns:a="http://schemas.openxmlformats.org/drawingml/2006/main" noChangeAspect="1"/>
+            </wp:cNvGraphicFramePr>
+            <a:graphic xmlns:a="http://schemas.openxmlformats.org/drawingml/2006/main">
+              <a:graphicData uri="http://schemas.openxmlformats.org/drawingml/2006/picture">
+                <pic:pic xmlns:pic="http://schemas.openxmlformats.org/drawingml/2006/picture">
+                  <pic:nvPicPr>
+                    <pic:cNvPr id="1863264551" name=""/>
+                    <pic:cNvPicPr/>
+                  </pic:nvPicPr>
+                  <pic:blipFill>
+                    <a:blip r:embed="rId79"/>
+                    <a:stretch>
+                      <a:fillRect/>
+                    </a:stretch>
+                  </pic:blipFill>
+                  <pic:spPr>
+                    <a:xfrm>
+                      <a:off x="0" y="0"/>
+                      <a:ext cx="2016387" cy="1362637"/>
+                    </a:xfrm>
+                    <a:prstGeom prst="rect">
+                      <a:avLst/>
+                    </a:prstGeom>
+                  </pic:spPr>
+                </pic:pic>
+              </a:graphicData>
+            </a:graphic>
+          </wp:inline>
+        </w:drawing>
+      </w:r>
+    </w:p>
+    <w:p>
+      <w:pPr>
+        <w:rPr>
+          <w:sz w:val="40"/>
+          <w:szCs w:val="40"/>
+        </w:rPr>
+      </w:pPr>
+      <w:r>
+        <w:rPr>
+          <w:sz w:val="40"/>
+          <w:szCs w:val="40"/>
+        </w:rPr>
+        <w:t>store.js:</w:t>
+      </w:r>
+    </w:p>
+    <w:p>
+      <w:pPr>
+        <w:rPr>
+          <w:sz w:val="40"/>
+          <w:szCs w:val="40"/>
+        </w:rPr>
+      </w:pPr>
+      <w:r>
+        <w:rPr>
+          <w:noProof/>
+        </w:rPr>
+        <w:drawing>
+          <wp:inline distT="0" distB="0" distL="0" distR="0" wp14:anchorId="1C4C132F" wp14:editId="2D88B3F0">
+            <wp:extent cx="2228850" cy="1076325"/>
+            <wp:effectExtent l="0" t="0" r="0" b="9525"/>
+            <wp:docPr id="69182540" name="Picture 1"/>
+            <wp:cNvGraphicFramePr>
+              <a:graphicFrameLocks xmlns:a="http://schemas.openxmlformats.org/drawingml/2006/main" noChangeAspect="1"/>
+            </wp:cNvGraphicFramePr>
+            <a:graphic xmlns:a="http://schemas.openxmlformats.org/drawingml/2006/main">
+              <a:graphicData uri="http://schemas.openxmlformats.org/drawingml/2006/picture">
+                <pic:pic xmlns:pic="http://schemas.openxmlformats.org/drawingml/2006/picture">
+                  <pic:nvPicPr>
+                    <pic:cNvPr id="69182540" name=""/>
+                    <pic:cNvPicPr/>
+                  </pic:nvPicPr>
+                  <pic:blipFill>
+                    <a:blip r:embed="rId80"/>
+                    <a:stretch>
+                      <a:fillRect/>
+                    </a:stretch>
+                  </pic:blipFill>
+                  <pic:spPr>
+                    <a:xfrm>
+                      <a:off x="0" y="0"/>
+                      <a:ext cx="2228850" cy="1076325"/>
+                    </a:xfrm>
+                    <a:prstGeom prst="rect">
+                      <a:avLst/>
+                    </a:prstGeom>
+                  </pic:spPr>
+                </pic:pic>
+              </a:graphicData>
+            </a:graphic>
+          </wp:inline>
+        </w:drawing>
+      </w:r>
+    </w:p>
+    <w:p>
+      <w:pPr>
+        <w:rPr>
+          <w:sz w:val="40"/>
+          <w:szCs w:val="40"/>
+        </w:rPr>
+      </w:pPr>
+      <w:r>
+        <w:rPr>
+          <w:sz w:val="40"/>
+          <w:szCs w:val="40"/>
+        </w:rPr>
+        <w:t>+Add Menu Items to Cart:</w:t>
+      </w:r>
+    </w:p>
+    <w:p>
+      <w:pPr>
+        <w:rPr>
+          <w:sz w:val="40"/>
+          <w:szCs w:val="40"/>
+        </w:rPr>
+      </w:pPr>
+      <w:r>
+        <w:rPr>
+          <w:noProof/>
+        </w:rPr>
+        <w:drawing>
+          <wp:inline distT="0" distB="0" distL="0" distR="0" wp14:anchorId="5AA9103B" wp14:editId="2BEC7424">
+            <wp:extent cx="2059560" cy="1711842"/>
+            <wp:effectExtent l="0" t="0" r="0" b="3175"/>
+            <wp:docPr id="589027608" name="Picture 1"/>
+            <wp:cNvGraphicFramePr>
+              <a:graphicFrameLocks xmlns:a="http://schemas.openxmlformats.org/drawingml/2006/main" noChangeAspect="1"/>
+            </wp:cNvGraphicFramePr>
+            <a:graphic xmlns:a="http://schemas.openxmlformats.org/drawingml/2006/main">
+              <a:graphicData uri="http://schemas.openxmlformats.org/drawingml/2006/picture">
+                <pic:pic xmlns:pic="http://schemas.openxmlformats.org/drawingml/2006/picture">
+                  <pic:nvPicPr>
+                    <pic:cNvPr id="589027608" name=""/>
+                    <pic:cNvPicPr/>
+                  </pic:nvPicPr>
+                  <pic:blipFill>
+                    <a:blip r:embed="rId81"/>
+                    <a:stretch>
+                      <a:fillRect/>
+                    </a:stretch>
+                  </pic:blipFill>
+                  <pic:spPr>
+                    <a:xfrm>
+                      <a:off x="0" y="0"/>
+                      <a:ext cx="2065142" cy="1716481"/>
+                    </a:xfrm>
+                    <a:prstGeom prst="rect">
+                      <a:avLst/>
+                    </a:prstGeom>
+                  </pic:spPr>
+                </pic:pic>
+              </a:graphicData>
+            </a:graphic>
+          </wp:inline>
+        </w:drawing>
+      </w:r>
+    </w:p>
+    <w:p>
+      <w:pPr>
+        <w:rPr>
+          <w:sz w:val="40"/>
+          <w:szCs w:val="40"/>
+        </w:rPr>
+      </w:pPr>
+      <w:r>
+        <w:rPr>
+          <w:sz w:val="40"/>
+          <w:szCs w:val="40"/>
+        </w:rPr>
+        <w:t>+Build the Cart Overview with Redux Selector:</w:t>
+      </w:r>
+    </w:p>
+    <w:p>
+      <w:pPr>
+        <w:rPr>
+          <w:sz w:val="40"/>
+          <w:szCs w:val="40"/>
+        </w:rPr>
+      </w:pPr>
+      <w:r>
+        <w:rPr>
+          <w:sz w:val="40"/>
+          <w:szCs w:val="40"/>
+        </w:rPr>
+        <w:t>cartSlide.js</w:t>
+      </w:r>
+    </w:p>
+    <w:p>
+      <w:pPr>
+        <w:rPr>
+          <w:sz w:val="40"/>
+          <w:szCs w:val="40"/>
+        </w:rPr>
+      </w:pPr>
+      <w:r>
+        <w:rPr>
+          <w:noProof/>
+        </w:rPr>
+        <w:drawing>
+          <wp:inline distT="0" distB="0" distL="0" distR="0" wp14:anchorId="38A863DB" wp14:editId="5B5B898B">
+            <wp:extent cx="4114800" cy="767988"/>
+            <wp:effectExtent l="0" t="0" r="0" b="0"/>
+            <wp:docPr id="998546405" name="Picture 1"/>
+            <wp:cNvGraphicFramePr>
+              <a:graphicFrameLocks xmlns:a="http://schemas.openxmlformats.org/drawingml/2006/main" noChangeAspect="1"/>
+            </wp:cNvGraphicFramePr>
+            <a:graphic xmlns:a="http://schemas.openxmlformats.org/drawingml/2006/main">
+              <a:graphicData uri="http://schemas.openxmlformats.org/drawingml/2006/picture">
+                <pic:pic xmlns:pic="http://schemas.openxmlformats.org/drawingml/2006/picture">
+                  <pic:nvPicPr>
+                    <pic:cNvPr id="998546405" name=""/>
+                    <pic:cNvPicPr/>
+                  </pic:nvPicPr>
+                  <pic:blipFill>
+                    <a:blip r:embed="rId82"/>
+                    <a:stretch>
+                      <a:fillRect/>
+                    </a:stretch>
+                  </pic:blipFill>
+                  <pic:spPr>
+                    <a:xfrm>
+                      <a:off x="0" y="0"/>
+                      <a:ext cx="4140034" cy="772698"/>
+                    </a:xfrm>
+                    <a:prstGeom prst="rect">
+                      <a:avLst/>
+                    </a:prstGeom>
+                  </pic:spPr>
+                </pic:pic>
+              </a:graphicData>
+            </a:graphic>
+          </wp:inline>
+        </w:drawing>
+      </w:r>
+    </w:p>
+    <w:p>
+      <w:pPr>
+        <w:rPr>
+          <w:sz w:val="40"/>
+          <w:szCs w:val="40"/>
+        </w:rPr>
+      </w:pPr>
+      <w:proofErr w:type="spellStart"/>
+      <w:r>
+        <w:rPr>
+          <w:sz w:val="40"/>
+          <w:szCs w:val="40"/>
+        </w:rPr>
+        <w:t>CartOverview.jsx</w:t>
+      </w:r>
+      <w:proofErr w:type="spellEnd"/>
+      <w:r>
+        <w:rPr>
+          <w:sz w:val="40"/>
+          <w:szCs w:val="40"/>
+        </w:rPr>
+        <w:t>:</w:t>
+      </w:r>
+    </w:p>
+    <w:p>
+      <w:pPr>
+        <w:rPr>
+          <w:sz w:val="40"/>
+          <w:szCs w:val="40"/>
+        </w:rPr>
+      </w:pPr>
+      <w:r>
+        <w:rPr>
+          <w:noProof/>
+        </w:rPr>
+        <w:lastRenderedPageBreak/>
+        <w:drawing>
+          <wp:inline distT="0" distB="0" distL="0" distR="0" wp14:anchorId="2D280D97" wp14:editId="74F78B25">
+            <wp:extent cx="3296093" cy="1980864"/>
+            <wp:effectExtent l="0" t="0" r="0" b="635"/>
+            <wp:docPr id="1399631458" name="Picture 1"/>
+            <wp:cNvGraphicFramePr>
+              <a:graphicFrameLocks xmlns:a="http://schemas.openxmlformats.org/drawingml/2006/main" noChangeAspect="1"/>
+            </wp:cNvGraphicFramePr>
+            <a:graphic xmlns:a="http://schemas.openxmlformats.org/drawingml/2006/main">
+              <a:graphicData uri="http://schemas.openxmlformats.org/drawingml/2006/picture">
+                <pic:pic xmlns:pic="http://schemas.openxmlformats.org/drawingml/2006/picture">
+                  <pic:nvPicPr>
+                    <pic:cNvPr id="1399631458" name=""/>
+                    <pic:cNvPicPr/>
+                  </pic:nvPicPr>
+                  <pic:blipFill>
+                    <a:blip r:embed="rId83"/>
+                    <a:stretch>
+                      <a:fillRect/>
+                    </a:stretch>
+                  </pic:blipFill>
+                  <pic:spPr>
+                    <a:xfrm>
+                      <a:off x="0" y="0"/>
+                      <a:ext cx="3302439" cy="1984678"/>
+                    </a:xfrm>
+                    <a:prstGeom prst="rect">
+                      <a:avLst/>
+                    </a:prstGeom>
+                  </pic:spPr>
+                </pic:pic>
+              </a:graphicData>
+            </a:graphic>
+          </wp:inline>
+        </w:drawing>
+      </w:r>
+    </w:p>
+    <w:p>
+      <w:pPr>
+        <w:rPr>
+          <w:sz w:val="40"/>
+          <w:szCs w:val="40"/>
+        </w:rPr>
+      </w:pPr>
+      <w:r>
+        <w:rPr>
+          <w:sz w:val="40"/>
+          <w:szCs w:val="40"/>
+        </w:rPr>
+        <w:t>+Build the Cart Page</w:t>
+      </w:r>
+    </w:p>
+    <w:p>
+      <w:pPr>
+        <w:rPr>
+          <w:sz w:val="40"/>
+          <w:szCs w:val="40"/>
+        </w:rPr>
+      </w:pPr>
+      <w:r>
+        <w:rPr>
+          <w:noProof/>
+        </w:rPr>
+        <w:drawing>
+          <wp:inline distT="0" distB="0" distL="0" distR="0" wp14:anchorId="76FD3470" wp14:editId="6AD1B009">
+            <wp:extent cx="3695700" cy="200025"/>
+            <wp:effectExtent l="0" t="0" r="0" b="9525"/>
+            <wp:docPr id="547469358" name="Picture 1"/>
+            <wp:cNvGraphicFramePr>
+              <a:graphicFrameLocks xmlns:a="http://schemas.openxmlformats.org/drawingml/2006/main" noChangeAspect="1"/>
+            </wp:cNvGraphicFramePr>
+            <a:graphic xmlns:a="http://schemas.openxmlformats.org/drawingml/2006/main">
+              <a:graphicData uri="http://schemas.openxmlformats.org/drawingml/2006/picture">
+                <pic:pic xmlns:pic="http://schemas.openxmlformats.org/drawingml/2006/picture">
+                  <pic:nvPicPr>
+                    <pic:cNvPr id="547469358" name=""/>
+                    <pic:cNvPicPr/>
+                  </pic:nvPicPr>
+                  <pic:blipFill>
+                    <a:blip r:embed="rId84"/>
+                    <a:stretch>
+                      <a:fillRect/>
+                    </a:stretch>
+                  </pic:blipFill>
+                  <pic:spPr>
+                    <a:xfrm>
+                      <a:off x="0" y="0"/>
+                      <a:ext cx="3695700" cy="200025"/>
+                    </a:xfrm>
+                    <a:prstGeom prst="rect">
+                      <a:avLst/>
+                    </a:prstGeom>
+                  </pic:spPr>
+                </pic:pic>
+              </a:graphicData>
+            </a:graphic>
+          </wp:inline>
+        </w:drawing>
+      </w:r>
+    </w:p>
+    <w:p>
+      <w:pPr>
+        <w:rPr>
+          <w:sz w:val="40"/>
+          <w:szCs w:val="40"/>
+        </w:rPr>
+      </w:pPr>
+      <w:r>
+        <w:rPr>
+          <w:noProof/>
+        </w:rPr>
+        <w:drawing>
+          <wp:inline distT="0" distB="0" distL="0" distR="0" wp14:anchorId="79C3200F" wp14:editId="3F66628A">
+            <wp:extent cx="4029075" cy="916449"/>
+            <wp:effectExtent l="0" t="0" r="0" b="0"/>
+            <wp:docPr id="37840614" name="Picture 1"/>
+            <wp:cNvGraphicFramePr>
+              <a:graphicFrameLocks xmlns:a="http://schemas.openxmlformats.org/drawingml/2006/main" noChangeAspect="1"/>
+            </wp:cNvGraphicFramePr>
+            <a:graphic xmlns:a="http://schemas.openxmlformats.org/drawingml/2006/main">
+              <a:graphicData uri="http://schemas.openxmlformats.org/drawingml/2006/picture">
+                <pic:pic xmlns:pic="http://schemas.openxmlformats.org/drawingml/2006/picture">
+                  <pic:nvPicPr>
+                    <pic:cNvPr id="37840614" name=""/>
+                    <pic:cNvPicPr/>
+                  </pic:nvPicPr>
+                  <pic:blipFill>
+                    <a:blip r:embed="rId85"/>
+                    <a:stretch>
+                      <a:fillRect/>
+                    </a:stretch>
+                  </pic:blipFill>
+                  <pic:spPr>
+                    <a:xfrm>
+                      <a:off x="0" y="0"/>
+                      <a:ext cx="4040011" cy="918936"/>
+                    </a:xfrm>
+                    <a:prstGeom prst="rect">
+                      <a:avLst/>
+                    </a:prstGeom>
+                  </pic:spPr>
+                </pic:pic>
+              </a:graphicData>
+            </a:graphic>
+          </wp:inline>
+        </w:drawing>
+      </w:r>
+    </w:p>
+    <w:p>
+      <w:pPr>
+        <w:rPr>
+          <w:sz w:val="40"/>
+          <w:szCs w:val="40"/>
+        </w:rPr>
+      </w:pPr>
+      <w:r>
+        <w:rPr>
+          <w:noProof/>
+        </w:rPr>
+        <w:drawing>
+          <wp:inline distT="0" distB="0" distL="0" distR="0" wp14:anchorId="23CADE14" wp14:editId="65BF9239">
+            <wp:extent cx="4067175" cy="1490098"/>
+            <wp:effectExtent l="0" t="0" r="0" b="0"/>
+            <wp:docPr id="1827058616" name="Picture 1"/>
+            <wp:cNvGraphicFramePr>
+              <a:graphicFrameLocks xmlns:a="http://schemas.openxmlformats.org/drawingml/2006/main" noChangeAspect="1"/>
+            </wp:cNvGraphicFramePr>
+            <a:graphic xmlns:a="http://schemas.openxmlformats.org/drawingml/2006/main">
+              <a:graphicData uri="http://schemas.openxmlformats.org/drawingml/2006/picture">
+                <pic:pic xmlns:pic="http://schemas.openxmlformats.org/drawingml/2006/picture">
+                  <pic:nvPicPr>
+                    <pic:cNvPr id="1827058616" name=""/>
+                    <pic:cNvPicPr/>
+                  </pic:nvPicPr>
+                  <pic:blipFill>
+                    <a:blip r:embed="rId86"/>
+                    <a:stretch>
+                      <a:fillRect/>
+                    </a:stretch>
+                  </pic:blipFill>
+                  <pic:spPr>
+                    <a:xfrm>
+                      <a:off x="0" y="0"/>
+                      <a:ext cx="4090573" cy="1498670"/>
+                    </a:xfrm>
+                    <a:prstGeom prst="rect">
+                      <a:avLst/>
+                    </a:prstGeom>
+                  </pic:spPr>
+                </pic:pic>
+              </a:graphicData>
+            </a:graphic>
+          </wp:inline>
+        </w:drawing>
+      </w:r>
+    </w:p>
+    <w:p>
+      <w:pPr>
+        <w:rPr>
+          <w:sz w:val="40"/>
+          <w:szCs w:val="40"/>
+        </w:rPr>
+      </w:pPr>
+      <w:r>
+        <w:rPr>
+          <w:noProof/>
+        </w:rPr>
+        <w:drawing>
+          <wp:inline distT="0" distB="0" distL="0" distR="0" wp14:anchorId="2E042489" wp14:editId="3BBE5A10">
+            <wp:extent cx="4048125" cy="1258726"/>
+            <wp:effectExtent l="0" t="0" r="0" b="0"/>
+            <wp:docPr id="964019204" name="Picture 1"/>
+            <wp:cNvGraphicFramePr>
+              <a:graphicFrameLocks xmlns:a="http://schemas.openxmlformats.org/drawingml/2006/main" noChangeAspect="1"/>
+            </wp:cNvGraphicFramePr>
+            <a:graphic xmlns:a="http://schemas.openxmlformats.org/drawingml/2006/main">
+              <a:graphicData uri="http://schemas.openxmlformats.org/drawingml/2006/picture">
+                <pic:pic xmlns:pic="http://schemas.openxmlformats.org/drawingml/2006/picture">
+                  <pic:nvPicPr>
+                    <pic:cNvPr id="964019204" name=""/>
+                    <pic:cNvPicPr/>
+                  </pic:nvPicPr>
+                  <pic:blipFill>
+                    <a:blip r:embed="rId87"/>
+                    <a:stretch>
+                      <a:fillRect/>
+                    </a:stretch>
+                  </pic:blipFill>
+                  <pic:spPr>
+                    <a:xfrm>
+                      <a:off x="0" y="0"/>
+                      <a:ext cx="4061573" cy="1262908"/>
+                    </a:xfrm>
+                    <a:prstGeom prst="rect">
+                      <a:avLst/>
+                    </a:prstGeom>
+                  </pic:spPr>
+                </pic:pic>
+              </a:graphicData>
+            </a:graphic>
+          </wp:inline>
+        </w:drawing>
+      </w:r>
+    </w:p>
+    <w:p>
+      <w:pPr>
+        <w:rPr>
+          <w:sz w:val="40"/>
+          <w:szCs w:val="40"/>
+        </w:rPr>
+      </w:pPr>
+      <w:r>
+        <w:rPr>
+          <w:sz w:val="40"/>
+          <w:szCs w:val="40"/>
+        </w:rPr>
+        <w:t>+Delete Cart Items</w:t>
+      </w:r>
+    </w:p>
+    <w:p>
+      <w:pPr>
+        <w:rPr>
+          <w:sz w:val="40"/>
+          <w:szCs w:val="40"/>
+        </w:rPr>
+      </w:pPr>
+      <w:r>
+        <w:rPr>
+          <w:sz w:val="40"/>
+          <w:szCs w:val="40"/>
+        </w:rPr>
+        <w:t>cartSlice.js:</w:t>
+      </w:r>
+    </w:p>
+    <w:p>
+      <w:pPr>
+        <w:rPr>
+          <w:sz w:val="40"/>
+          <w:szCs w:val="40"/>
+        </w:rPr>
+      </w:pPr>
+      <w:r>
+        <w:rPr>
+          <w:noProof/>
+        </w:rPr>
+        <w:drawing>
+          <wp:inline distT="0" distB="0" distL="0" distR="0" wp14:anchorId="509773DF" wp14:editId="29437D03">
+            <wp:extent cx="4276725" cy="304907"/>
+            <wp:effectExtent l="0" t="0" r="0" b="0"/>
+            <wp:docPr id="1107305367" name="Picture 1"/>
+            <wp:cNvGraphicFramePr>
+              <a:graphicFrameLocks xmlns:a="http://schemas.openxmlformats.org/drawingml/2006/main" noChangeAspect="1"/>
+            </wp:cNvGraphicFramePr>
+            <a:graphic xmlns:a="http://schemas.openxmlformats.org/drawingml/2006/main">
+              <a:graphicData uri="http://schemas.openxmlformats.org/drawingml/2006/picture">
+                <pic:pic xmlns:pic="http://schemas.openxmlformats.org/drawingml/2006/picture">
+                  <pic:nvPicPr>
+                    <pic:cNvPr id="1107305367" name=""/>
+                    <pic:cNvPicPr/>
+                  </pic:nvPicPr>
+                  <pic:blipFill>
+                    <a:blip r:embed="rId88"/>
+                    <a:stretch>
+                      <a:fillRect/>
+                    </a:stretch>
+                  </pic:blipFill>
+                  <pic:spPr>
+                    <a:xfrm>
+                      <a:off x="0" y="0"/>
+                      <a:ext cx="4322874" cy="308197"/>
+                    </a:xfrm>
+                    <a:prstGeom prst="rect">
+                      <a:avLst/>
+                    </a:prstGeom>
+                  </pic:spPr>
+                </pic:pic>
+              </a:graphicData>
+            </a:graphic>
+          </wp:inline>
+        </w:drawing>
+      </w:r>
+    </w:p>
+    <w:p>
+      <w:pPr>
+        <w:rPr>
+          <w:sz w:val="40"/>
+          <w:szCs w:val="40"/>
+        </w:rPr>
+      </w:pPr>
+      <w:proofErr w:type="spellStart"/>
+      <w:r>
+        <w:rPr>
+          <w:sz w:val="40"/>
+          <w:szCs w:val="40"/>
+        </w:rPr>
+        <w:lastRenderedPageBreak/>
+        <w:t>DeleteItem.jsx</w:t>
+      </w:r>
+      <w:proofErr w:type="spellEnd"/>
+    </w:p>
+    <w:p>
+      <w:pPr>
+        <w:rPr>
+          <w:sz w:val="40"/>
+          <w:szCs w:val="40"/>
+        </w:rPr>
+      </w:pPr>
+      <w:r>
+        <w:rPr>
+          <w:noProof/>
+        </w:rPr>
+        <w:drawing>
+          <wp:inline distT="0" distB="0" distL="0" distR="0" wp14:anchorId="63745133" wp14:editId="1DB3B5B6">
+            <wp:extent cx="4324350" cy="1210818"/>
+            <wp:effectExtent l="0" t="0" r="0" b="8890"/>
+            <wp:docPr id="303040574" name="Picture 1"/>
+            <wp:cNvGraphicFramePr>
+              <a:graphicFrameLocks xmlns:a="http://schemas.openxmlformats.org/drawingml/2006/main" noChangeAspect="1"/>
+            </wp:cNvGraphicFramePr>
+            <a:graphic xmlns:a="http://schemas.openxmlformats.org/drawingml/2006/main">
+              <a:graphicData uri="http://schemas.openxmlformats.org/drawingml/2006/picture">
+                <pic:pic xmlns:pic="http://schemas.openxmlformats.org/drawingml/2006/picture">
+                  <pic:nvPicPr>
+                    <pic:cNvPr id="303040574" name=""/>
+                    <pic:cNvPicPr/>
+                  </pic:nvPicPr>
+                  <pic:blipFill>
+                    <a:blip r:embed="rId89"/>
+                    <a:stretch>
+                      <a:fillRect/>
+                    </a:stretch>
+                  </pic:blipFill>
+                  <pic:spPr>
+                    <a:xfrm>
+                      <a:off x="0" y="0"/>
+                      <a:ext cx="4339292" cy="1215002"/>
+                    </a:xfrm>
+                    <a:prstGeom prst="rect">
+                      <a:avLst/>
+                    </a:prstGeom>
+                  </pic:spPr>
+                </pic:pic>
+              </a:graphicData>
+            </a:graphic>
+          </wp:inline>
+        </w:drawing>
+      </w:r>
+    </w:p>
+    <w:p>
+      <w:pPr>
+        <w:rPr>
+          <w:sz w:val="40"/>
+          <w:szCs w:val="40"/>
+        </w:rPr>
+      </w:pPr>
     </w:p>
     <w:sectPr>
       <w:pgSz w:w="12240" w:h="15840"/>
@@ -3901,6 +5095,7 @@
   <w:style w:type="character" w:default="1" w:styleId="DefaultParagraphFont">
     <w:name w:val="Default Paragraph Font"/>
     <w:uiPriority w:val="1"/>
+    <w:semiHidden/>
     <w:unhideWhenUsed/>
   </w:style>
   <w:style w:type="table" w:default="1" w:styleId="TableNormal">

</xml_diff>